<commit_message>
update UML's diagrams for group homework
</commit_message>
<xml_diff>
--- a/bai-tap/bai-tap-nhom/quan-ly-nha-sach/bao-cao-bai-tap-nhom-quan-ly-nha-sach.docx
+++ b/bai-tap/bai-tap-nhom/quan-ly-nha-sach/bao-cao-bai-tap-nhom-quan-ly-nha-sach.docx
@@ -1,6 +1,6 @@
 
 <file path=word/document.xml><?xml version="1.0" encoding="utf-8"?>
-<w:document xmlns:wpc="http://schemas.microsoft.com/office/word/2010/wordprocessingCanvas" xmlns:cx="http://schemas.microsoft.com/office/drawing/2014/chartex" xmlns:cx1="http://schemas.microsoft.com/office/drawing/2015/9/8/chartex" xmlns:cx2="http://schemas.microsoft.com/office/drawing/2015/10/21/chartex" xmlns:cx3="http://schemas.microsoft.com/office/drawing/2016/5/9/chartex" xmlns:cx4="http://schemas.microsoft.com/office/drawing/2016/5/10/chartex" xmlns:cx5="http://schemas.microsoft.com/office/drawing/2016/5/11/chartex" xmlns:cx6="http://schemas.microsoft.com/office/drawing/2016/5/12/chartex" xmlns:cx7="http://schemas.microsoft.com/office/drawing/2016/5/13/chartex" xmlns:cx8="http://schemas.microsoft.com/office/drawing/2016/5/14/chartex" xmlns:mc="http://schemas.openxmlformats.org/markup-compatibility/2006" xmlns:aink="http://schemas.microsoft.com/office/drawing/2016/ink" xmlns:am3d="http://schemas.microsoft.com/office/drawing/2017/model3d" xmlns:o="urn:schemas-microsoft-com:office:office" xmlns:r="http://schemas.openxmlformats.org/officeDocument/2006/relationships" xmlns:m="http://schemas.openxmlformats.org/officeDocument/2006/math" xmlns:v="urn:schemas-microsoft-com:vml" xmlns:wp14="http://schemas.microsoft.com/office/word/2010/wordprocessingDrawing" xmlns:wp="http://schemas.openxmlformats.org/drawingml/2006/wordprocessingDrawing" xmlns:w10="urn:schemas-microsoft-com:office:word" xmlns:w="http://schemas.openxmlformats.org/wordprocessingml/2006/main" xmlns:w14="http://schemas.microsoft.com/office/word/2010/wordml" xmlns:w15="http://schemas.microsoft.com/office/word/2012/wordml" xmlns:w16cex="http://schemas.microsoft.com/office/word/2018/wordml/cex" xmlns:w16cid="http://schemas.microsoft.com/office/word/2016/wordml/cid" xmlns:w16="http://schemas.microsoft.com/office/word/2018/wordml" xmlns:w16sdtdh="http://schemas.microsoft.com/office/word/2020/wordml/sdtdatahash" xmlns:w16se="http://schemas.microsoft.com/office/word/2015/wordml/symex" xmlns:wpg="http://schemas.microsoft.com/office/word/2010/wordprocessingGroup" xmlns:wpi="http://schemas.microsoft.com/office/word/2010/wordprocessingInk" xmlns:wne="http://schemas.microsoft.com/office/word/2006/wordml" xmlns:wps="http://schemas.microsoft.com/office/word/2010/wordprocessingShape" mc:Ignorable="w14 w15 w16se w16cid w16 w16cex w16sdtdh wp14">
+<w:document xmlns:wpc="http://schemas.microsoft.com/office/word/2010/wordprocessingCanvas" xmlns:cx="http://schemas.microsoft.com/office/drawing/2014/chartex" xmlns:cx1="http://schemas.microsoft.com/office/drawing/2015/9/8/chartex" xmlns:cx2="http://schemas.microsoft.com/office/drawing/2015/10/21/chartex" xmlns:cx3="http://schemas.microsoft.com/office/drawing/2016/5/9/chartex" xmlns:cx4="http://schemas.microsoft.com/office/drawing/2016/5/10/chartex" xmlns:cx5="http://schemas.microsoft.com/office/drawing/2016/5/11/chartex" xmlns:cx6="http://schemas.microsoft.com/office/drawing/2016/5/12/chartex" xmlns:cx7="http://schemas.microsoft.com/office/drawing/2016/5/13/chartex" xmlns:cx8="http://schemas.microsoft.com/office/drawing/2016/5/14/chartex" xmlns:mc="http://schemas.openxmlformats.org/markup-compatibility/2006" xmlns:aink="http://schemas.microsoft.com/office/drawing/2016/ink" xmlns:am3d="http://schemas.microsoft.com/office/drawing/2017/model3d" xmlns:o="urn:schemas-microsoft-com:office:office" xmlns:oel="http://schemas.microsoft.com/office/2019/extlst" xmlns:r="http://schemas.openxmlformats.org/officeDocument/2006/relationships" xmlns:m="http://schemas.openxmlformats.org/officeDocument/2006/math" xmlns:v="urn:schemas-microsoft-com:vml" xmlns:wp14="http://schemas.microsoft.com/office/word/2010/wordprocessingDrawing" xmlns:wp="http://schemas.openxmlformats.org/drawingml/2006/wordprocessingDrawing" xmlns:w10="urn:schemas-microsoft-com:office:word" xmlns:w="http://schemas.openxmlformats.org/wordprocessingml/2006/main" xmlns:w14="http://schemas.microsoft.com/office/word/2010/wordml" xmlns:w15="http://schemas.microsoft.com/office/word/2012/wordml" xmlns:w16cex="http://schemas.microsoft.com/office/word/2018/wordml/cex" xmlns:w16cid="http://schemas.microsoft.com/office/word/2016/wordml/cid" xmlns:w16="http://schemas.microsoft.com/office/word/2018/wordml" xmlns:w16sdtdh="http://schemas.microsoft.com/office/word/2020/wordml/sdtdatahash" xmlns:w16se="http://schemas.microsoft.com/office/word/2015/wordml/symex" xmlns:wpg="http://schemas.microsoft.com/office/word/2010/wordprocessingGroup" xmlns:wpi="http://schemas.microsoft.com/office/word/2010/wordprocessingInk" xmlns:wne="http://schemas.microsoft.com/office/word/2006/wordml" xmlns:wps="http://schemas.microsoft.com/office/word/2010/wordprocessingShape" mc:Ignorable="w14 w15 w16se w16cid w16 w16cex w16sdtdh wp14">
   <w:body>
     <w:p>
       <w:pPr>
@@ -14,8 +14,8 @@
         </w:rPr>
       </w:pPr>
       <w:bookmarkStart w:id="0" w:name="_Hlk93040589"/>
-      <w:bookmarkStart w:id="1" w:name="_Toc51061469"/>
-      <w:bookmarkStart w:id="2" w:name="_Toc51060025"/>
+      <w:bookmarkStart w:id="1" w:name="_Toc51060025"/>
+      <w:bookmarkStart w:id="2" w:name="_Toc51061469"/>
       <w:bookmarkEnd w:id="0"/>
       <w:r>
         <w:rPr>
@@ -1242,7 +1242,21 @@
                 <w:rStyle w:val="Hyperlink"/>
                 <w:noProof/>
               </w:rPr>
-              <w:t>Sơ đồ tuần tự (Sequence Diagram)</w:t>
+              <w:t>Sơ đồ tuầ</w:t>
+            </w:r>
+            <w:r>
+              <w:rPr>
+                <w:rStyle w:val="Hyperlink"/>
+                <w:noProof/>
+              </w:rPr>
+              <w:t>n</w:t>
+            </w:r>
+            <w:r>
+              <w:rPr>
+                <w:rStyle w:val="Hyperlink"/>
+                <w:noProof/>
+              </w:rPr>
+              <w:t xml:space="preserve"> tự (Sequence Diagram)</w:t>
             </w:r>
             <w:r>
               <w:rPr>
@@ -8040,10 +8054,10 @@
           <w:noProof/>
         </w:rPr>
         <w:drawing>
-          <wp:inline distT="0" distB="0" distL="0" distR="0" wp14:anchorId="772FCBA7" wp14:editId="103E6B32">
-            <wp:extent cx="5584190" cy="4925786"/>
-            <wp:effectExtent l="0" t="0" r="0" b="8255"/>
-            <wp:docPr id="1" name="Picture 1"/>
+          <wp:inline distT="0" distB="0" distL="0" distR="0" wp14:anchorId="6E10AF24" wp14:editId="3445B17F">
+            <wp:extent cx="5760085" cy="5040630"/>
+            <wp:effectExtent l="0" t="0" r="0" b="0"/>
+            <wp:docPr id="18" name="Picture 18"/>
             <wp:cNvGraphicFramePr>
               <a:graphicFrameLocks xmlns:a="http://schemas.openxmlformats.org/drawingml/2006/main" noChangeAspect="1"/>
             </wp:cNvGraphicFramePr>
@@ -8051,12 +8065,10 @@
               <a:graphicData uri="http://schemas.openxmlformats.org/drawingml/2006/picture">
                 <pic:pic xmlns:pic="http://schemas.openxmlformats.org/drawingml/2006/picture">
                   <pic:nvPicPr>
-                    <pic:cNvPr id="0" name="Picture 1"/>
-                    <pic:cNvPicPr>
-                      <a:picLocks noChangeAspect="1" noChangeArrowheads="1"/>
-                    </pic:cNvPicPr>
+                    <pic:cNvPr id="18" name="Picture 18"/>
+                    <pic:cNvPicPr/>
                   </pic:nvPicPr>
-                  <pic:blipFill rotWithShape="1">
+                  <pic:blipFill>
                     <a:blip r:embed="rId10" cstate="print">
                       <a:extLst>
                         <a:ext uri="{28A0092B-C50C-407E-A947-70E740481C1C}">
@@ -8064,26 +8076,18 @@
                         </a:ext>
                       </a:extLst>
                     </a:blip>
-                    <a:srcRect r="2804" b="2053"/>
-                    <a:stretch/>
+                    <a:stretch>
+                      <a:fillRect/>
+                    </a:stretch>
                   </pic:blipFill>
-                  <pic:spPr bwMode="auto">
+                  <pic:spPr>
                     <a:xfrm>
                       <a:off x="0" y="0"/>
-                      <a:ext cx="5584372" cy="4925947"/>
+                      <a:ext cx="5760085" cy="5040630"/>
                     </a:xfrm>
                     <a:prstGeom prst="rect">
                       <a:avLst/>
                     </a:prstGeom>
-                    <a:noFill/>
-                    <a:ln>
-                      <a:noFill/>
-                    </a:ln>
-                    <a:extLst>
-                      <a:ext uri="{53640926-AAD7-44D8-BBD7-CCE9431645EC}">
-                        <a14:shadowObscured xmlns:a14="http://schemas.microsoft.com/office/drawing/2010/main"/>
-                      </a:ext>
-                    </a:extLst>
                   </pic:spPr>
                 </pic:pic>
               </a:graphicData>
@@ -24462,13 +24466,12 @@
         <w:rPr>
           <w:rFonts w:cs="Times New Roman"/>
           <w:noProof/>
-          <w:lang w:val="en-US"/>
         </w:rPr>
         <w:drawing>
-          <wp:inline distT="0" distB="0" distL="0" distR="0" wp14:anchorId="0DDDD7DB" wp14:editId="6AF23472">
-            <wp:extent cx="5747821" cy="3827585"/>
-            <wp:effectExtent l="0" t="0" r="5715" b="1905"/>
-            <wp:docPr id="5" name="Picture 5"/>
+          <wp:inline distT="0" distB="0" distL="0" distR="0" wp14:anchorId="0AE32BE8" wp14:editId="0661A9E2">
+            <wp:extent cx="5760085" cy="3773170"/>
+            <wp:effectExtent l="0" t="0" r="0" b="0"/>
+            <wp:docPr id="4" name="Picture 4"/>
             <wp:cNvGraphicFramePr>
               <a:graphicFrameLocks xmlns:a="http://schemas.openxmlformats.org/drawingml/2006/main" noChangeAspect="1"/>
             </wp:cNvGraphicFramePr>
@@ -24476,12 +24479,10 @@
               <a:graphicData uri="http://schemas.openxmlformats.org/drawingml/2006/picture">
                 <pic:pic xmlns:pic="http://schemas.openxmlformats.org/drawingml/2006/picture">
                   <pic:nvPicPr>
-                    <pic:cNvPr id="0" name="Picture 3"/>
-                    <pic:cNvPicPr>
-                      <a:picLocks noChangeAspect="1" noChangeArrowheads="1"/>
-                    </pic:cNvPicPr>
+                    <pic:cNvPr id="4" name="Picture 4"/>
+                    <pic:cNvPicPr/>
                   </pic:nvPicPr>
-                  <pic:blipFill rotWithShape="1">
+                  <pic:blipFill>
                     <a:blip r:embed="rId11" cstate="print">
                       <a:extLst>
                         <a:ext uri="{28A0092B-C50C-407E-A947-70E740481C1C}">
@@ -24489,26 +24490,18 @@
                         </a:ext>
                       </a:extLst>
                     </a:blip>
-                    <a:srcRect r="1654"/>
-                    <a:stretch/>
+                    <a:stretch>
+                      <a:fillRect/>
+                    </a:stretch>
                   </pic:blipFill>
-                  <pic:spPr bwMode="auto">
+                  <pic:spPr>
                     <a:xfrm>
                       <a:off x="0" y="0"/>
-                      <a:ext cx="5749945" cy="3828999"/>
+                      <a:ext cx="5760085" cy="3773170"/>
                     </a:xfrm>
                     <a:prstGeom prst="rect">
                       <a:avLst/>
                     </a:prstGeom>
-                    <a:noFill/>
-                    <a:ln>
-                      <a:noFill/>
-                    </a:ln>
-                    <a:extLst>
-                      <a:ext uri="{53640926-AAD7-44D8-BBD7-CCE9431645EC}">
-                        <a14:shadowObscured xmlns:a14="http://schemas.microsoft.com/office/drawing/2010/main"/>
-                      </a:ext>
-                    </a:extLst>
                   </pic:spPr>
                 </pic:pic>
               </a:graphicData>
@@ -24701,13 +24694,12 @@
         <w:rPr>
           <w:rFonts w:cs="Times New Roman"/>
           <w:noProof/>
-          <w:lang w:val="en-US"/>
         </w:rPr>
         <w:drawing>
-          <wp:inline distT="0" distB="0" distL="0" distR="0" wp14:anchorId="5E5B5CC0" wp14:editId="14212770">
-            <wp:extent cx="5739642" cy="4824047"/>
+          <wp:inline distT="0" distB="0" distL="0" distR="0" wp14:anchorId="19379FC4" wp14:editId="4116C564">
+            <wp:extent cx="5760085" cy="4768850"/>
             <wp:effectExtent l="0" t="0" r="0" b="0"/>
-            <wp:docPr id="6" name="Picture 6"/>
+            <wp:docPr id="19" name="Picture 19"/>
             <wp:cNvGraphicFramePr>
               <a:graphicFrameLocks xmlns:a="http://schemas.openxmlformats.org/drawingml/2006/main" noChangeAspect="1"/>
             </wp:cNvGraphicFramePr>
@@ -24715,12 +24707,10 @@
               <a:graphicData uri="http://schemas.openxmlformats.org/drawingml/2006/picture">
                 <pic:pic xmlns:pic="http://schemas.openxmlformats.org/drawingml/2006/picture">
                   <pic:nvPicPr>
-                    <pic:cNvPr id="0" name="Picture 4"/>
-                    <pic:cNvPicPr>
-                      <a:picLocks noChangeAspect="1" noChangeArrowheads="1"/>
-                    </pic:cNvPicPr>
+                    <pic:cNvPr id="19" name="Picture 19"/>
+                    <pic:cNvPicPr/>
                   </pic:nvPicPr>
-                  <pic:blipFill rotWithShape="1">
+                  <pic:blipFill>
                     <a:blip r:embed="rId12" cstate="print">
                       <a:extLst>
                         <a:ext uri="{28A0092B-C50C-407E-A947-70E740481C1C}">
@@ -24728,26 +24718,18 @@
                         </a:ext>
                       </a:extLst>
                     </a:blip>
-                    <a:srcRect r="1484"/>
-                    <a:stretch/>
+                    <a:stretch>
+                      <a:fillRect/>
+                    </a:stretch>
                   </pic:blipFill>
-                  <pic:spPr bwMode="auto">
+                  <pic:spPr>
                     <a:xfrm>
                       <a:off x="0" y="0"/>
-                      <a:ext cx="5741635" cy="4825722"/>
+                      <a:ext cx="5760085" cy="4768850"/>
                     </a:xfrm>
                     <a:prstGeom prst="rect">
                       <a:avLst/>
                     </a:prstGeom>
-                    <a:noFill/>
-                    <a:ln>
-                      <a:noFill/>
-                    </a:ln>
-                    <a:extLst>
-                      <a:ext uri="{53640926-AAD7-44D8-BBD7-CCE9431645EC}">
-                        <a14:shadowObscured xmlns:a14="http://schemas.microsoft.com/office/drawing/2010/main"/>
-                      </a:ext>
-                    </a:extLst>
                   </pic:spPr>
                 </pic:pic>
               </a:graphicData>
@@ -24924,13 +24906,12 @@
         <w:rPr>
           <w:rFonts w:cs="Times New Roman"/>
           <w:noProof/>
-          <w:lang w:val="en-US"/>
         </w:rPr>
         <w:drawing>
-          <wp:inline distT="0" distB="0" distL="0" distR="0" wp14:anchorId="5A054682" wp14:editId="1158FA4C">
-            <wp:extent cx="5710216" cy="4360985"/>
-            <wp:effectExtent l="0" t="0" r="5080" b="1905"/>
-            <wp:docPr id="9" name="Picture 9"/>
+          <wp:inline distT="0" distB="0" distL="0" distR="0" wp14:anchorId="501E23A5" wp14:editId="3AE8CC83">
+            <wp:extent cx="5760085" cy="4328160"/>
+            <wp:effectExtent l="0" t="0" r="0" b="0"/>
+            <wp:docPr id="20" name="Picture 20"/>
             <wp:cNvGraphicFramePr>
               <a:graphicFrameLocks xmlns:a="http://schemas.openxmlformats.org/drawingml/2006/main" noChangeAspect="1"/>
             </wp:cNvGraphicFramePr>
@@ -24938,12 +24919,10 @@
               <a:graphicData uri="http://schemas.openxmlformats.org/drawingml/2006/picture">
                 <pic:pic xmlns:pic="http://schemas.openxmlformats.org/drawingml/2006/picture">
                   <pic:nvPicPr>
-                    <pic:cNvPr id="0" name="Picture 7"/>
-                    <pic:cNvPicPr>
-                      <a:picLocks noChangeAspect="1" noChangeArrowheads="1"/>
-                    </pic:cNvPicPr>
+                    <pic:cNvPr id="20" name="Picture 20"/>
+                    <pic:cNvPicPr/>
                   </pic:nvPicPr>
-                  <pic:blipFill rotWithShape="1">
+                  <pic:blipFill>
                     <a:blip r:embed="rId13" cstate="print">
                       <a:extLst>
                         <a:ext uri="{28A0092B-C50C-407E-A947-70E740481C1C}">
@@ -24951,26 +24930,18 @@
                         </a:ext>
                       </a:extLst>
                     </a:blip>
-                    <a:srcRect r="1579"/>
-                    <a:stretch/>
+                    <a:stretch>
+                      <a:fillRect/>
+                    </a:stretch>
                   </pic:blipFill>
-                  <pic:spPr bwMode="auto">
+                  <pic:spPr>
                     <a:xfrm>
                       <a:off x="0" y="0"/>
-                      <a:ext cx="5722330" cy="4370237"/>
+                      <a:ext cx="5760085" cy="4328160"/>
                     </a:xfrm>
                     <a:prstGeom prst="rect">
                       <a:avLst/>
                     </a:prstGeom>
-                    <a:noFill/>
-                    <a:ln>
-                      <a:noFill/>
-                    </a:ln>
-                    <a:extLst>
-                      <a:ext uri="{53640926-AAD7-44D8-BBD7-CCE9431645EC}">
-                        <a14:shadowObscured xmlns:a14="http://schemas.microsoft.com/office/drawing/2010/main"/>
-                      </a:ext>
-                    </a:extLst>
                   </pic:spPr>
                 </pic:pic>
               </a:graphicData>
@@ -25150,13 +25121,12 @@
         <w:rPr>
           <w:rFonts w:cs="Times New Roman"/>
           <w:noProof/>
-          <w:lang w:val="en-US"/>
         </w:rPr>
         <w:drawing>
-          <wp:inline distT="0" distB="0" distL="0" distR="0" wp14:anchorId="042B54D0" wp14:editId="20E38EC3">
-            <wp:extent cx="5740431" cy="8141677"/>
+          <wp:inline distT="0" distB="0" distL="0" distR="0" wp14:anchorId="3DE206CC" wp14:editId="201B1E38">
+            <wp:extent cx="5760085" cy="8048625"/>
             <wp:effectExtent l="0" t="0" r="0" b="0"/>
-            <wp:docPr id="10" name="Picture 10"/>
+            <wp:docPr id="22" name="Picture 22"/>
             <wp:cNvGraphicFramePr>
               <a:graphicFrameLocks xmlns:a="http://schemas.openxmlformats.org/drawingml/2006/main" noChangeAspect="1"/>
             </wp:cNvGraphicFramePr>
@@ -25164,12 +25134,10 @@
               <a:graphicData uri="http://schemas.openxmlformats.org/drawingml/2006/picture">
                 <pic:pic xmlns:pic="http://schemas.openxmlformats.org/drawingml/2006/picture">
                   <pic:nvPicPr>
-                    <pic:cNvPr id="0" name="Picture 8"/>
-                    <pic:cNvPicPr>
-                      <a:picLocks noChangeAspect="1" noChangeArrowheads="1"/>
-                    </pic:cNvPicPr>
+                    <pic:cNvPr id="22" name="Picture 22"/>
+                    <pic:cNvPicPr/>
                   </pic:nvPicPr>
-                  <pic:blipFill rotWithShape="1">
+                  <pic:blipFill>
                     <a:blip r:embed="rId14" cstate="print">
                       <a:extLst>
                         <a:ext uri="{28A0092B-C50C-407E-A947-70E740481C1C}">
@@ -25177,26 +25145,18 @@
                         </a:ext>
                       </a:extLst>
                     </a:blip>
-                    <a:srcRect r="1477"/>
-                    <a:stretch/>
+                    <a:stretch>
+                      <a:fillRect/>
+                    </a:stretch>
                   </pic:blipFill>
-                  <pic:spPr bwMode="auto">
+                  <pic:spPr>
                     <a:xfrm>
                       <a:off x="0" y="0"/>
-                      <a:ext cx="5748162" cy="8152641"/>
+                      <a:ext cx="5760085" cy="8048625"/>
                     </a:xfrm>
                     <a:prstGeom prst="rect">
                       <a:avLst/>
                     </a:prstGeom>
-                    <a:noFill/>
-                    <a:ln>
-                      <a:noFill/>
-                    </a:ln>
-                    <a:extLst>
-                      <a:ext uri="{53640926-AAD7-44D8-BBD7-CCE9431645EC}">
-                        <a14:shadowObscured xmlns:a14="http://schemas.microsoft.com/office/drawing/2010/main"/>
-                      </a:ext>
-                    </a:extLst>
                   </pic:spPr>
                 </pic:pic>
               </a:graphicData>
@@ -25355,13 +25315,12 @@
         <w:rPr>
           <w:rFonts w:cs="Times New Roman"/>
           <w:noProof/>
-          <w:lang w:val="en-US"/>
         </w:rPr>
         <w:drawing>
-          <wp:inline distT="0" distB="0" distL="0" distR="0" wp14:anchorId="74476F35" wp14:editId="0BAD6268">
-            <wp:extent cx="5734857" cy="3944815"/>
+          <wp:inline distT="0" distB="0" distL="0" distR="0" wp14:anchorId="39CC502B" wp14:editId="2931622D">
+            <wp:extent cx="5760085" cy="3900805"/>
             <wp:effectExtent l="0" t="0" r="0" b="0"/>
-            <wp:docPr id="11" name="Picture 11"/>
+            <wp:docPr id="23" name="Picture 23"/>
             <wp:cNvGraphicFramePr>
               <a:graphicFrameLocks xmlns:a="http://schemas.openxmlformats.org/drawingml/2006/main" noChangeAspect="1"/>
             </wp:cNvGraphicFramePr>
@@ -25369,12 +25328,10 @@
               <a:graphicData uri="http://schemas.openxmlformats.org/drawingml/2006/picture">
                 <pic:pic xmlns:pic="http://schemas.openxmlformats.org/drawingml/2006/picture">
                   <pic:nvPicPr>
-                    <pic:cNvPr id="0" name="Picture 9"/>
-                    <pic:cNvPicPr>
-                      <a:picLocks noChangeAspect="1" noChangeArrowheads="1"/>
-                    </pic:cNvPicPr>
+                    <pic:cNvPr id="23" name="Picture 23"/>
+                    <pic:cNvPicPr/>
                   </pic:nvPicPr>
-                  <pic:blipFill rotWithShape="1">
+                  <pic:blipFill>
                     <a:blip r:embed="rId15" cstate="print">
                       <a:extLst>
                         <a:ext uri="{28A0092B-C50C-407E-A947-70E740481C1C}">
@@ -25382,26 +25339,18 @@
                         </a:ext>
                       </a:extLst>
                     </a:blip>
-                    <a:srcRect r="1586"/>
-                    <a:stretch/>
+                    <a:stretch>
+                      <a:fillRect/>
+                    </a:stretch>
                   </pic:blipFill>
-                  <pic:spPr bwMode="auto">
+                  <pic:spPr>
                     <a:xfrm>
                       <a:off x="0" y="0"/>
-                      <a:ext cx="5743928" cy="3951054"/>
+                      <a:ext cx="5760085" cy="3900805"/>
                     </a:xfrm>
                     <a:prstGeom prst="rect">
                       <a:avLst/>
                     </a:prstGeom>
-                    <a:noFill/>
-                    <a:ln>
-                      <a:noFill/>
-                    </a:ln>
-                    <a:extLst>
-                      <a:ext uri="{53640926-AAD7-44D8-BBD7-CCE9431645EC}">
-                        <a14:shadowObscured xmlns:a14="http://schemas.microsoft.com/office/drawing/2010/main"/>
-                      </a:ext>
-                    </a:extLst>
                   </pic:spPr>
                 </pic:pic>
               </a:graphicData>
@@ -25577,13 +25526,12 @@
         <w:rPr>
           <w:rFonts w:cs="Times New Roman"/>
           <w:noProof/>
-          <w:lang w:val="en-US"/>
         </w:rPr>
         <w:drawing>
-          <wp:inline distT="0" distB="0" distL="0" distR="0" wp14:anchorId="2E607FFD" wp14:editId="4BB34948">
-            <wp:extent cx="5742129" cy="5873262"/>
+          <wp:inline distT="0" distB="0" distL="0" distR="0" wp14:anchorId="06446644" wp14:editId="42ECFDF8">
+            <wp:extent cx="5760085" cy="5808980"/>
             <wp:effectExtent l="0" t="0" r="0" b="0"/>
-            <wp:docPr id="12" name="Picture 12"/>
+            <wp:docPr id="26" name="Picture 26"/>
             <wp:cNvGraphicFramePr>
               <a:graphicFrameLocks xmlns:a="http://schemas.openxmlformats.org/drawingml/2006/main" noChangeAspect="1"/>
             </wp:cNvGraphicFramePr>
@@ -25591,12 +25539,10 @@
               <a:graphicData uri="http://schemas.openxmlformats.org/drawingml/2006/picture">
                 <pic:pic xmlns:pic="http://schemas.openxmlformats.org/drawingml/2006/picture">
                   <pic:nvPicPr>
-                    <pic:cNvPr id="0" name="Picture 10"/>
-                    <pic:cNvPicPr>
-                      <a:picLocks noChangeAspect="1" noChangeArrowheads="1"/>
-                    </pic:cNvPicPr>
+                    <pic:cNvPr id="26" name="Picture 26"/>
+                    <pic:cNvPicPr/>
                   </pic:nvPicPr>
-                  <pic:blipFill rotWithShape="1">
+                  <pic:blipFill>
                     <a:blip r:embed="rId16" cstate="print">
                       <a:extLst>
                         <a:ext uri="{28A0092B-C50C-407E-A947-70E740481C1C}">
@@ -25604,26 +25550,18 @@
                         </a:ext>
                       </a:extLst>
                     </a:blip>
-                    <a:srcRect r="1477"/>
-                    <a:stretch/>
+                    <a:stretch>
+                      <a:fillRect/>
+                    </a:stretch>
                   </pic:blipFill>
-                  <pic:spPr bwMode="auto">
+                  <pic:spPr>
                     <a:xfrm>
                       <a:off x="0" y="0"/>
-                      <a:ext cx="5745089" cy="5876290"/>
+                      <a:ext cx="5760085" cy="5808980"/>
                     </a:xfrm>
                     <a:prstGeom prst="rect">
                       <a:avLst/>
                     </a:prstGeom>
-                    <a:noFill/>
-                    <a:ln>
-                      <a:noFill/>
-                    </a:ln>
-                    <a:extLst>
-                      <a:ext uri="{53640926-AAD7-44D8-BBD7-CCE9431645EC}">
-                        <a14:shadowObscured xmlns:a14="http://schemas.microsoft.com/office/drawing/2010/main"/>
-                      </a:ext>
-                    </a:extLst>
                   </pic:spPr>
                 </pic:pic>
               </a:graphicData>
@@ -25802,10 +25740,10 @@
           <w:noProof/>
         </w:rPr>
         <w:drawing>
-          <wp:inline distT="0" distB="0" distL="0" distR="0" wp14:anchorId="27B981F4" wp14:editId="2106A119">
-            <wp:extent cx="5729549" cy="3780692"/>
-            <wp:effectExtent l="0" t="0" r="5080" b="0"/>
-            <wp:docPr id="13" name="Picture 13"/>
+          <wp:inline distT="0" distB="0" distL="0" distR="0" wp14:anchorId="5F563993" wp14:editId="0C807802">
+            <wp:extent cx="5760085" cy="3737610"/>
+            <wp:effectExtent l="0" t="0" r="0" b="0"/>
+            <wp:docPr id="27" name="Picture 27"/>
             <wp:cNvGraphicFramePr>
               <a:graphicFrameLocks xmlns:a="http://schemas.openxmlformats.org/drawingml/2006/main" noChangeAspect="1"/>
             </wp:cNvGraphicFramePr>
@@ -25813,12 +25751,10 @@
               <a:graphicData uri="http://schemas.openxmlformats.org/drawingml/2006/picture">
                 <pic:pic xmlns:pic="http://schemas.openxmlformats.org/drawingml/2006/picture">
                   <pic:nvPicPr>
-                    <pic:cNvPr id="0" name="Picture 11"/>
-                    <pic:cNvPicPr>
-                      <a:picLocks noChangeAspect="1" noChangeArrowheads="1"/>
-                    </pic:cNvPicPr>
+                    <pic:cNvPr id="27" name="Picture 27"/>
+                    <pic:cNvPicPr/>
                   </pic:nvPicPr>
-                  <pic:blipFill rotWithShape="1">
+                  <pic:blipFill>
                     <a:blip r:embed="rId17" cstate="print">
                       <a:extLst>
                         <a:ext uri="{28A0092B-C50C-407E-A947-70E740481C1C}">
@@ -25826,26 +25762,18 @@
                         </a:ext>
                       </a:extLst>
                     </a:blip>
-                    <a:srcRect r="1586"/>
-                    <a:stretch/>
+                    <a:stretch>
+                      <a:fillRect/>
+                    </a:stretch>
                   </pic:blipFill>
-                  <pic:spPr bwMode="auto">
+                  <pic:spPr>
                     <a:xfrm>
                       <a:off x="0" y="0"/>
-                      <a:ext cx="5741515" cy="3788588"/>
+                      <a:ext cx="5760085" cy="3737610"/>
                     </a:xfrm>
                     <a:prstGeom prst="rect">
                       <a:avLst/>
                     </a:prstGeom>
-                    <a:noFill/>
-                    <a:ln>
-                      <a:noFill/>
-                    </a:ln>
-                    <a:extLst>
-                      <a:ext uri="{53640926-AAD7-44D8-BBD7-CCE9431645EC}">
-                        <a14:shadowObscured xmlns:a14="http://schemas.microsoft.com/office/drawing/2010/main"/>
-                      </a:ext>
-                    </a:extLst>
                   </pic:spPr>
                 </pic:pic>
               </a:graphicData>
@@ -26030,10 +25958,10 @@
           <w:lang w:val="en-US"/>
         </w:rPr>
         <w:drawing>
-          <wp:inline distT="0" distB="0" distL="0" distR="0" wp14:anchorId="4CFF3B01" wp14:editId="419D4935">
-            <wp:extent cx="5588000" cy="4876800"/>
+          <wp:inline distT="0" distB="0" distL="0" distR="0" wp14:anchorId="71DD756D" wp14:editId="7984DE1A">
+            <wp:extent cx="5760085" cy="5093970"/>
             <wp:effectExtent l="0" t="0" r="0" b="0"/>
-            <wp:docPr id="41" name="Picture 41"/>
+            <wp:docPr id="35" name="Picture 35"/>
             <wp:cNvGraphicFramePr>
               <a:graphicFrameLocks xmlns:a="http://schemas.openxmlformats.org/drawingml/2006/main" noChangeAspect="1"/>
             </wp:cNvGraphicFramePr>
@@ -26041,12 +25969,10 @@
               <a:graphicData uri="http://schemas.openxmlformats.org/drawingml/2006/picture">
                 <pic:pic xmlns:pic="http://schemas.openxmlformats.org/drawingml/2006/picture">
                   <pic:nvPicPr>
-                    <pic:cNvPr id="0" name="Picture 2"/>
-                    <pic:cNvPicPr>
-                      <a:picLocks noChangeAspect="1" noChangeArrowheads="1"/>
-                    </pic:cNvPicPr>
+                    <pic:cNvPr id="35" name="Picture 35"/>
+                    <pic:cNvPicPr/>
                   </pic:nvPicPr>
-                  <pic:blipFill rotWithShape="1">
+                  <pic:blipFill>
                     <a:blip r:embed="rId18">
                       <a:extLst>
                         <a:ext uri="{28A0092B-C50C-407E-A947-70E740481C1C}">
@@ -26054,26 +25980,18 @@
                         </a:ext>
                       </a:extLst>
                     </a:blip>
-                    <a:srcRect r="2870" b="4000"/>
-                    <a:stretch/>
+                    <a:stretch>
+                      <a:fillRect/>
+                    </a:stretch>
                   </pic:blipFill>
-                  <pic:spPr bwMode="auto">
+                  <pic:spPr>
                     <a:xfrm>
                       <a:off x="0" y="0"/>
-                      <a:ext cx="5588000" cy="4876800"/>
+                      <a:ext cx="5760085" cy="5093970"/>
                     </a:xfrm>
                     <a:prstGeom prst="rect">
                       <a:avLst/>
                     </a:prstGeom>
-                    <a:noFill/>
-                    <a:ln>
-                      <a:noFill/>
-                    </a:ln>
-                    <a:extLst>
-                      <a:ext uri="{53640926-AAD7-44D8-BBD7-CCE9431645EC}">
-                        <a14:shadowObscured xmlns:a14="http://schemas.microsoft.com/office/drawing/2010/main"/>
-                      </a:ext>
-                    </a:extLst>
                   </pic:spPr>
                 </pic:pic>
               </a:graphicData>
@@ -26093,25 +26011,51 @@
       <w:r>
         <w:t xml:space="preserve">Hình </w:t>
       </w:r>
-      <w:fldSimple w:instr=" STYLEREF 1 \s ">
-        <w:r>
-          <w:rPr>
-            <w:noProof/>
-          </w:rPr>
-          <w:t>4</w:t>
-        </w:r>
-      </w:fldSimple>
+      <w:r>
+        <w:fldChar w:fldCharType="begin"/>
+      </w:r>
+      <w:r>
+        <w:instrText xml:space="preserve"> STYLEREF 1 \s </w:instrText>
+      </w:r>
+      <w:r>
+        <w:fldChar w:fldCharType="separate"/>
+      </w:r>
+      <w:r>
+        <w:rPr>
+          <w:noProof/>
+        </w:rPr>
+        <w:t>4</w:t>
+      </w:r>
+      <w:r>
+        <w:rPr>
+          <w:noProof/>
+        </w:rPr>
+        <w:fldChar w:fldCharType="end"/>
+      </w:r>
       <w:r>
         <w:t>.</w:t>
       </w:r>
-      <w:fldSimple w:instr=" SEQ Hình \* ARABIC \s 1 ">
-        <w:r>
-          <w:rPr>
-            <w:noProof/>
-          </w:rPr>
-          <w:t>9</w:t>
-        </w:r>
-      </w:fldSimple>
+      <w:r>
+        <w:fldChar w:fldCharType="begin"/>
+      </w:r>
+      <w:r>
+        <w:instrText xml:space="preserve"> SEQ Hình \* ARABIC \s 1 </w:instrText>
+      </w:r>
+      <w:r>
+        <w:fldChar w:fldCharType="separate"/>
+      </w:r>
+      <w:r>
+        <w:rPr>
+          <w:noProof/>
+        </w:rPr>
+        <w:t>9</w:t>
+      </w:r>
+      <w:r>
+        <w:rPr>
+          <w:noProof/>
+        </w:rPr>
+        <w:fldChar w:fldCharType="end"/>
+      </w:r>
       <w:r>
         <w:rPr>
           <w:noProof/>
@@ -29886,25 +29830,51 @@
       <w:r>
         <w:t xml:space="preserve">Hình </w:t>
       </w:r>
-      <w:fldSimple w:instr=" STYLEREF 1 \s ">
-        <w:r>
-          <w:rPr>
-            <w:noProof/>
-          </w:rPr>
-          <w:t>4</w:t>
-        </w:r>
-      </w:fldSimple>
+      <w:r>
+        <w:fldChar w:fldCharType="begin"/>
+      </w:r>
+      <w:r>
+        <w:instrText xml:space="preserve"> STYLEREF 1 \s </w:instrText>
+      </w:r>
+      <w:r>
+        <w:fldChar w:fldCharType="separate"/>
+      </w:r>
+      <w:r>
+        <w:rPr>
+          <w:noProof/>
+        </w:rPr>
+        <w:t>4</w:t>
+      </w:r>
+      <w:r>
+        <w:rPr>
+          <w:noProof/>
+        </w:rPr>
+        <w:fldChar w:fldCharType="end"/>
+      </w:r>
       <w:r>
         <w:t>.</w:t>
       </w:r>
-      <w:fldSimple w:instr=" SEQ Hình \* ARABIC \s 1 ">
-        <w:r>
-          <w:rPr>
-            <w:noProof/>
-          </w:rPr>
-          <w:t>10</w:t>
-        </w:r>
-      </w:fldSimple>
+      <w:r>
+        <w:fldChar w:fldCharType="begin"/>
+      </w:r>
+      <w:r>
+        <w:instrText xml:space="preserve"> SEQ Hình \* ARABIC \s 1 </w:instrText>
+      </w:r>
+      <w:r>
+        <w:fldChar w:fldCharType="separate"/>
+      </w:r>
+      <w:r>
+        <w:rPr>
+          <w:noProof/>
+        </w:rPr>
+        <w:t>10</w:t>
+      </w:r>
+      <w:r>
+        <w:rPr>
+          <w:noProof/>
+        </w:rPr>
+        <w:fldChar w:fldCharType="end"/>
+      </w:r>
       <w:r>
         <w:rPr>
           <w:noProof/>
@@ -30103,25 +30073,51 @@
       <w:r>
         <w:t xml:space="preserve">Hình </w:t>
       </w:r>
-      <w:fldSimple w:instr=" STYLEREF 1 \s ">
-        <w:r>
-          <w:rPr>
-            <w:noProof/>
-          </w:rPr>
-          <w:t>4</w:t>
-        </w:r>
-      </w:fldSimple>
+      <w:r>
+        <w:fldChar w:fldCharType="begin"/>
+      </w:r>
+      <w:r>
+        <w:instrText xml:space="preserve"> STYLEREF 1 \s </w:instrText>
+      </w:r>
+      <w:r>
+        <w:fldChar w:fldCharType="separate"/>
+      </w:r>
+      <w:r>
+        <w:rPr>
+          <w:noProof/>
+        </w:rPr>
+        <w:t>4</w:t>
+      </w:r>
+      <w:r>
+        <w:rPr>
+          <w:noProof/>
+        </w:rPr>
+        <w:fldChar w:fldCharType="end"/>
+      </w:r>
       <w:r>
         <w:t>.</w:t>
       </w:r>
-      <w:fldSimple w:instr=" SEQ Hình \* ARABIC \s 1 ">
-        <w:r>
-          <w:rPr>
-            <w:noProof/>
-          </w:rPr>
-          <w:t>11</w:t>
-        </w:r>
-      </w:fldSimple>
+      <w:r>
+        <w:fldChar w:fldCharType="begin"/>
+      </w:r>
+      <w:r>
+        <w:instrText xml:space="preserve"> SEQ Hình \* ARABIC \s 1 </w:instrText>
+      </w:r>
+      <w:r>
+        <w:fldChar w:fldCharType="separate"/>
+      </w:r>
+      <w:r>
+        <w:rPr>
+          <w:noProof/>
+        </w:rPr>
+        <w:t>11</w:t>
+      </w:r>
+      <w:r>
+        <w:rPr>
+          <w:noProof/>
+        </w:rPr>
+        <w:fldChar w:fldCharType="end"/>
+      </w:r>
       <w:r>
         <w:rPr>
           <w:noProof/>
@@ -30584,25 +30580,51 @@
       <w:r>
         <w:t xml:space="preserve">Bảng </w:t>
       </w:r>
-      <w:fldSimple w:instr=" STYLEREF 1 \s ">
-        <w:r>
-          <w:rPr>
-            <w:noProof/>
-          </w:rPr>
-          <w:t>4</w:t>
-        </w:r>
-      </w:fldSimple>
+      <w:r>
+        <w:fldChar w:fldCharType="begin"/>
+      </w:r>
+      <w:r>
+        <w:instrText xml:space="preserve"> STYLEREF 1 \s </w:instrText>
+      </w:r>
+      <w:r>
+        <w:fldChar w:fldCharType="separate"/>
+      </w:r>
+      <w:r>
+        <w:rPr>
+          <w:noProof/>
+        </w:rPr>
+        <w:t>4</w:t>
+      </w:r>
+      <w:r>
+        <w:rPr>
+          <w:noProof/>
+        </w:rPr>
+        <w:fldChar w:fldCharType="end"/>
+      </w:r>
       <w:r>
         <w:t>.</w:t>
       </w:r>
-      <w:fldSimple w:instr=" SEQ Bảng \* ARABIC \s 1 ">
-        <w:r>
-          <w:rPr>
-            <w:noProof/>
-          </w:rPr>
-          <w:t>15</w:t>
-        </w:r>
-      </w:fldSimple>
+      <w:r>
+        <w:fldChar w:fldCharType="begin"/>
+      </w:r>
+      <w:r>
+        <w:instrText xml:space="preserve"> SEQ Bảng \* ARABIC \s 1 </w:instrText>
+      </w:r>
+      <w:r>
+        <w:fldChar w:fldCharType="separate"/>
+      </w:r>
+      <w:r>
+        <w:rPr>
+          <w:noProof/>
+        </w:rPr>
+        <w:t>15</w:t>
+      </w:r>
+      <w:r>
+        <w:rPr>
+          <w:noProof/>
+        </w:rPr>
+        <w:fldChar w:fldCharType="end"/>
+      </w:r>
       <w:r>
         <w:rPr>
           <w:lang w:val="en-US"/>
@@ -30920,25 +30942,51 @@
       <w:r>
         <w:t xml:space="preserve">Hình </w:t>
       </w:r>
-      <w:fldSimple w:instr=" STYLEREF 1 \s ">
-        <w:r>
-          <w:rPr>
-            <w:noProof/>
-          </w:rPr>
-          <w:t>4</w:t>
-        </w:r>
-      </w:fldSimple>
+      <w:r>
+        <w:fldChar w:fldCharType="begin"/>
+      </w:r>
+      <w:r>
+        <w:instrText xml:space="preserve"> STYLEREF 1 \s </w:instrText>
+      </w:r>
+      <w:r>
+        <w:fldChar w:fldCharType="separate"/>
+      </w:r>
+      <w:r>
+        <w:rPr>
+          <w:noProof/>
+        </w:rPr>
+        <w:t>4</w:t>
+      </w:r>
+      <w:r>
+        <w:rPr>
+          <w:noProof/>
+        </w:rPr>
+        <w:fldChar w:fldCharType="end"/>
+      </w:r>
       <w:r>
         <w:t>.</w:t>
       </w:r>
-      <w:fldSimple w:instr=" SEQ Hình \* ARABIC \s 1 ">
-        <w:r>
-          <w:rPr>
-            <w:noProof/>
-          </w:rPr>
-          <w:t>12</w:t>
-        </w:r>
-      </w:fldSimple>
+      <w:r>
+        <w:fldChar w:fldCharType="begin"/>
+      </w:r>
+      <w:r>
+        <w:instrText xml:space="preserve"> SEQ Hình \* ARABIC \s 1 </w:instrText>
+      </w:r>
+      <w:r>
+        <w:fldChar w:fldCharType="separate"/>
+      </w:r>
+      <w:r>
+        <w:rPr>
+          <w:noProof/>
+        </w:rPr>
+        <w:t>12</w:t>
+      </w:r>
+      <w:r>
+        <w:rPr>
+          <w:noProof/>
+        </w:rPr>
+        <w:fldChar w:fldCharType="end"/>
+      </w:r>
       <w:r>
         <w:rPr>
           <w:noProof/>
@@ -31412,25 +31460,51 @@
       <w:r>
         <w:t xml:space="preserve">Bảng </w:t>
       </w:r>
-      <w:fldSimple w:instr=" STYLEREF 1 \s ">
-        <w:r>
-          <w:rPr>
-            <w:noProof/>
-          </w:rPr>
-          <w:t>4</w:t>
-        </w:r>
-      </w:fldSimple>
+      <w:r>
+        <w:fldChar w:fldCharType="begin"/>
+      </w:r>
+      <w:r>
+        <w:instrText xml:space="preserve"> STYLEREF 1 \s </w:instrText>
+      </w:r>
+      <w:r>
+        <w:fldChar w:fldCharType="separate"/>
+      </w:r>
+      <w:r>
+        <w:rPr>
+          <w:noProof/>
+        </w:rPr>
+        <w:t>4</w:t>
+      </w:r>
+      <w:r>
+        <w:rPr>
+          <w:noProof/>
+        </w:rPr>
+        <w:fldChar w:fldCharType="end"/>
+      </w:r>
       <w:r>
         <w:t>.</w:t>
       </w:r>
-      <w:fldSimple w:instr=" SEQ Bảng \* ARABIC \s 1 ">
-        <w:r>
-          <w:rPr>
-            <w:noProof/>
-          </w:rPr>
-          <w:t>16</w:t>
-        </w:r>
-      </w:fldSimple>
+      <w:r>
+        <w:fldChar w:fldCharType="begin"/>
+      </w:r>
+      <w:r>
+        <w:instrText xml:space="preserve"> SEQ Bảng \* ARABIC \s 1 </w:instrText>
+      </w:r>
+      <w:r>
+        <w:fldChar w:fldCharType="separate"/>
+      </w:r>
+      <w:r>
+        <w:rPr>
+          <w:noProof/>
+        </w:rPr>
+        <w:t>16</w:t>
+      </w:r>
+      <w:r>
+        <w:rPr>
+          <w:noProof/>
+        </w:rPr>
+        <w:fldChar w:fldCharType="end"/>
+      </w:r>
       <w:r>
         <w:rPr>
           <w:lang w:val="en-US"/>
@@ -31544,25 +31618,51 @@
       <w:r>
         <w:t xml:space="preserve">Hình </w:t>
       </w:r>
-      <w:fldSimple w:instr=" STYLEREF 1 \s ">
-        <w:r>
-          <w:rPr>
-            <w:noProof/>
-          </w:rPr>
-          <w:t>4</w:t>
-        </w:r>
-      </w:fldSimple>
+      <w:r>
+        <w:fldChar w:fldCharType="begin"/>
+      </w:r>
+      <w:r>
+        <w:instrText xml:space="preserve"> STYLEREF 1 \s </w:instrText>
+      </w:r>
+      <w:r>
+        <w:fldChar w:fldCharType="separate"/>
+      </w:r>
+      <w:r>
+        <w:rPr>
+          <w:noProof/>
+        </w:rPr>
+        <w:t>4</w:t>
+      </w:r>
+      <w:r>
+        <w:rPr>
+          <w:noProof/>
+        </w:rPr>
+        <w:fldChar w:fldCharType="end"/>
+      </w:r>
       <w:r>
         <w:t>.</w:t>
       </w:r>
-      <w:fldSimple w:instr=" SEQ Hình \* ARABIC \s 1 ">
-        <w:r>
-          <w:rPr>
-            <w:noProof/>
-          </w:rPr>
-          <w:t>13</w:t>
-        </w:r>
-      </w:fldSimple>
+      <w:r>
+        <w:fldChar w:fldCharType="begin"/>
+      </w:r>
+      <w:r>
+        <w:instrText xml:space="preserve"> SEQ Hình \* ARABIC \s 1 </w:instrText>
+      </w:r>
+      <w:r>
+        <w:fldChar w:fldCharType="separate"/>
+      </w:r>
+      <w:r>
+        <w:rPr>
+          <w:noProof/>
+        </w:rPr>
+        <w:t>13</w:t>
+      </w:r>
+      <w:r>
+        <w:rPr>
+          <w:noProof/>
+        </w:rPr>
+        <w:fldChar w:fldCharType="end"/>
+      </w:r>
       <w:r>
         <w:rPr>
           <w:noProof/>
@@ -32039,25 +32139,51 @@
       <w:r>
         <w:t xml:space="preserve">Bảng </w:t>
       </w:r>
-      <w:fldSimple w:instr=" STYLEREF 1 \s ">
-        <w:r>
-          <w:rPr>
-            <w:noProof/>
-          </w:rPr>
-          <w:t>4</w:t>
-        </w:r>
-      </w:fldSimple>
+      <w:r>
+        <w:fldChar w:fldCharType="begin"/>
+      </w:r>
+      <w:r>
+        <w:instrText xml:space="preserve"> STYLEREF 1 \s </w:instrText>
+      </w:r>
+      <w:r>
+        <w:fldChar w:fldCharType="separate"/>
+      </w:r>
+      <w:r>
+        <w:rPr>
+          <w:noProof/>
+        </w:rPr>
+        <w:t>4</w:t>
+      </w:r>
+      <w:r>
+        <w:rPr>
+          <w:noProof/>
+        </w:rPr>
+        <w:fldChar w:fldCharType="end"/>
+      </w:r>
       <w:r>
         <w:t>.</w:t>
       </w:r>
-      <w:fldSimple w:instr=" SEQ Bảng \* ARABIC \s 1 ">
-        <w:r>
-          <w:rPr>
-            <w:noProof/>
-          </w:rPr>
-          <w:t>17</w:t>
-        </w:r>
-      </w:fldSimple>
+      <w:r>
+        <w:fldChar w:fldCharType="begin"/>
+      </w:r>
+      <w:r>
+        <w:instrText xml:space="preserve"> SEQ Bảng \* ARABIC \s 1 </w:instrText>
+      </w:r>
+      <w:r>
+        <w:fldChar w:fldCharType="separate"/>
+      </w:r>
+      <w:r>
+        <w:rPr>
+          <w:noProof/>
+        </w:rPr>
+        <w:t>17</w:t>
+      </w:r>
+      <w:r>
+        <w:rPr>
+          <w:noProof/>
+        </w:rPr>
+        <w:fldChar w:fldCharType="end"/>
+      </w:r>
       <w:r>
         <w:rPr>
           <w:lang w:val="en-US"/>
@@ -32229,25 +32355,51 @@
       <w:r>
         <w:t xml:space="preserve">Hình </w:t>
       </w:r>
-      <w:fldSimple w:instr=" STYLEREF 1 \s ">
-        <w:r>
-          <w:rPr>
-            <w:noProof/>
-          </w:rPr>
-          <w:t>4</w:t>
-        </w:r>
-      </w:fldSimple>
+      <w:r>
+        <w:fldChar w:fldCharType="begin"/>
+      </w:r>
+      <w:r>
+        <w:instrText xml:space="preserve"> STYLEREF 1 \s </w:instrText>
+      </w:r>
+      <w:r>
+        <w:fldChar w:fldCharType="separate"/>
+      </w:r>
+      <w:r>
+        <w:rPr>
+          <w:noProof/>
+        </w:rPr>
+        <w:t>4</w:t>
+      </w:r>
+      <w:r>
+        <w:rPr>
+          <w:noProof/>
+        </w:rPr>
+        <w:fldChar w:fldCharType="end"/>
+      </w:r>
       <w:r>
         <w:t>.</w:t>
       </w:r>
-      <w:fldSimple w:instr=" SEQ Hình \* ARABIC \s 1 ">
-        <w:r>
-          <w:rPr>
-            <w:noProof/>
-          </w:rPr>
-          <w:t>14</w:t>
-        </w:r>
-      </w:fldSimple>
+      <w:r>
+        <w:fldChar w:fldCharType="begin"/>
+      </w:r>
+      <w:r>
+        <w:instrText xml:space="preserve"> SEQ Hình \* ARABIC \s 1 </w:instrText>
+      </w:r>
+      <w:r>
+        <w:fldChar w:fldCharType="separate"/>
+      </w:r>
+      <w:r>
+        <w:rPr>
+          <w:noProof/>
+        </w:rPr>
+        <w:t>14</w:t>
+      </w:r>
+      <w:r>
+        <w:rPr>
+          <w:noProof/>
+        </w:rPr>
+        <w:fldChar w:fldCharType="end"/>
+      </w:r>
       <w:r>
         <w:rPr>
           <w:noProof/>
@@ -32691,25 +32843,51 @@
       <w:r>
         <w:t xml:space="preserve">Bảng </w:t>
       </w:r>
-      <w:fldSimple w:instr=" STYLEREF 1 \s ">
-        <w:r>
-          <w:rPr>
-            <w:noProof/>
-          </w:rPr>
-          <w:t>4</w:t>
-        </w:r>
-      </w:fldSimple>
+      <w:r>
+        <w:fldChar w:fldCharType="begin"/>
+      </w:r>
+      <w:r>
+        <w:instrText xml:space="preserve"> STYLEREF 1 \s </w:instrText>
+      </w:r>
+      <w:r>
+        <w:fldChar w:fldCharType="separate"/>
+      </w:r>
+      <w:r>
+        <w:rPr>
+          <w:noProof/>
+        </w:rPr>
+        <w:t>4</w:t>
+      </w:r>
+      <w:r>
+        <w:rPr>
+          <w:noProof/>
+        </w:rPr>
+        <w:fldChar w:fldCharType="end"/>
+      </w:r>
       <w:r>
         <w:t>.</w:t>
       </w:r>
-      <w:fldSimple w:instr=" SEQ Bảng \* ARABIC \s 1 ">
-        <w:r>
-          <w:rPr>
-            <w:noProof/>
-          </w:rPr>
-          <w:t>18</w:t>
-        </w:r>
-      </w:fldSimple>
+      <w:r>
+        <w:fldChar w:fldCharType="begin"/>
+      </w:r>
+      <w:r>
+        <w:instrText xml:space="preserve"> SEQ Bảng \* ARABIC \s 1 </w:instrText>
+      </w:r>
+      <w:r>
+        <w:fldChar w:fldCharType="separate"/>
+      </w:r>
+      <w:r>
+        <w:rPr>
+          <w:noProof/>
+        </w:rPr>
+        <w:t>18</w:t>
+      </w:r>
+      <w:r>
+        <w:rPr>
+          <w:noProof/>
+        </w:rPr>
+        <w:fldChar w:fldCharType="end"/>
+      </w:r>
       <w:r>
         <w:rPr>
           <w:lang w:val="en-US"/>
@@ -32900,25 +33078,51 @@
       <w:r>
         <w:t xml:space="preserve">Hình </w:t>
       </w:r>
-      <w:fldSimple w:instr=" STYLEREF 1 \s ">
-        <w:r>
-          <w:rPr>
-            <w:noProof/>
-          </w:rPr>
-          <w:t>4</w:t>
-        </w:r>
-      </w:fldSimple>
+      <w:r>
+        <w:fldChar w:fldCharType="begin"/>
+      </w:r>
+      <w:r>
+        <w:instrText xml:space="preserve"> STYLEREF 1 \s </w:instrText>
+      </w:r>
+      <w:r>
+        <w:fldChar w:fldCharType="separate"/>
+      </w:r>
+      <w:r>
+        <w:rPr>
+          <w:noProof/>
+        </w:rPr>
+        <w:t>4</w:t>
+      </w:r>
+      <w:r>
+        <w:rPr>
+          <w:noProof/>
+        </w:rPr>
+        <w:fldChar w:fldCharType="end"/>
+      </w:r>
       <w:r>
         <w:t>.</w:t>
       </w:r>
-      <w:fldSimple w:instr=" SEQ Hình \* ARABIC \s 1 ">
-        <w:r>
-          <w:rPr>
-            <w:noProof/>
-          </w:rPr>
-          <w:t>15</w:t>
-        </w:r>
-      </w:fldSimple>
+      <w:r>
+        <w:fldChar w:fldCharType="begin"/>
+      </w:r>
+      <w:r>
+        <w:instrText xml:space="preserve"> SEQ Hình \* ARABIC \s 1 </w:instrText>
+      </w:r>
+      <w:r>
+        <w:fldChar w:fldCharType="separate"/>
+      </w:r>
+      <w:r>
+        <w:rPr>
+          <w:noProof/>
+        </w:rPr>
+        <w:t>15</w:t>
+      </w:r>
+      <w:r>
+        <w:rPr>
+          <w:noProof/>
+        </w:rPr>
+        <w:fldChar w:fldCharType="end"/>
+      </w:r>
       <w:r>
         <w:rPr>
           <w:noProof/>
@@ -33380,25 +33584,51 @@
       <w:r>
         <w:t xml:space="preserve">Bảng </w:t>
       </w:r>
-      <w:fldSimple w:instr=" STYLEREF 1 \s ">
-        <w:r>
-          <w:rPr>
-            <w:noProof/>
-          </w:rPr>
-          <w:t>4</w:t>
-        </w:r>
-      </w:fldSimple>
+      <w:r>
+        <w:fldChar w:fldCharType="begin"/>
+      </w:r>
+      <w:r>
+        <w:instrText xml:space="preserve"> STYLEREF 1 \s </w:instrText>
+      </w:r>
+      <w:r>
+        <w:fldChar w:fldCharType="separate"/>
+      </w:r>
+      <w:r>
+        <w:rPr>
+          <w:noProof/>
+        </w:rPr>
+        <w:t>4</w:t>
+      </w:r>
+      <w:r>
+        <w:rPr>
+          <w:noProof/>
+        </w:rPr>
+        <w:fldChar w:fldCharType="end"/>
+      </w:r>
       <w:r>
         <w:t>.</w:t>
       </w:r>
-      <w:fldSimple w:instr=" SEQ Bảng \* ARABIC \s 1 ">
-        <w:r>
-          <w:rPr>
-            <w:noProof/>
-          </w:rPr>
-          <w:t>19</w:t>
-        </w:r>
-      </w:fldSimple>
+      <w:r>
+        <w:fldChar w:fldCharType="begin"/>
+      </w:r>
+      <w:r>
+        <w:instrText xml:space="preserve"> SEQ Bảng \* ARABIC \s 1 </w:instrText>
+      </w:r>
+      <w:r>
+        <w:fldChar w:fldCharType="separate"/>
+      </w:r>
+      <w:r>
+        <w:rPr>
+          <w:noProof/>
+        </w:rPr>
+        <w:t>19</w:t>
+      </w:r>
+      <w:r>
+        <w:rPr>
+          <w:noProof/>
+        </w:rPr>
+        <w:fldChar w:fldCharType="end"/>
+      </w:r>
       <w:r>
         <w:rPr>
           <w:lang w:val="en-US"/>
@@ -33497,25 +33727,51 @@
       <w:r>
         <w:t xml:space="preserve">Hình </w:t>
       </w:r>
-      <w:fldSimple w:instr=" STYLEREF 1 \s ">
-        <w:r>
-          <w:rPr>
-            <w:noProof/>
-          </w:rPr>
-          <w:t>4</w:t>
-        </w:r>
-      </w:fldSimple>
+      <w:r>
+        <w:fldChar w:fldCharType="begin"/>
+      </w:r>
+      <w:r>
+        <w:instrText xml:space="preserve"> STYLEREF 1 \s </w:instrText>
+      </w:r>
+      <w:r>
+        <w:fldChar w:fldCharType="separate"/>
+      </w:r>
+      <w:r>
+        <w:rPr>
+          <w:noProof/>
+        </w:rPr>
+        <w:t>4</w:t>
+      </w:r>
+      <w:r>
+        <w:rPr>
+          <w:noProof/>
+        </w:rPr>
+        <w:fldChar w:fldCharType="end"/>
+      </w:r>
       <w:r>
         <w:t>.</w:t>
       </w:r>
-      <w:fldSimple w:instr=" SEQ Hình \* ARABIC \s 1 ">
-        <w:r>
-          <w:rPr>
-            <w:noProof/>
-          </w:rPr>
-          <w:t>16</w:t>
-        </w:r>
-      </w:fldSimple>
+      <w:r>
+        <w:fldChar w:fldCharType="begin"/>
+      </w:r>
+      <w:r>
+        <w:instrText xml:space="preserve"> SEQ Hình \* ARABIC \s 1 </w:instrText>
+      </w:r>
+      <w:r>
+        <w:fldChar w:fldCharType="separate"/>
+      </w:r>
+      <w:r>
+        <w:rPr>
+          <w:noProof/>
+        </w:rPr>
+        <w:t>16</w:t>
+      </w:r>
+      <w:r>
+        <w:rPr>
+          <w:noProof/>
+        </w:rPr>
+        <w:fldChar w:fldCharType="end"/>
+      </w:r>
       <w:r>
         <w:rPr>
           <w:noProof/>
@@ -34274,25 +34530,51 @@
       <w:r>
         <w:t xml:space="preserve">Bảng </w:t>
       </w:r>
-      <w:fldSimple w:instr=" STYLEREF 1 \s ">
-        <w:r>
-          <w:rPr>
-            <w:noProof/>
-          </w:rPr>
-          <w:t>4</w:t>
-        </w:r>
-      </w:fldSimple>
+      <w:r>
+        <w:fldChar w:fldCharType="begin"/>
+      </w:r>
+      <w:r>
+        <w:instrText xml:space="preserve"> STYLEREF 1 \s </w:instrText>
+      </w:r>
+      <w:r>
+        <w:fldChar w:fldCharType="separate"/>
+      </w:r>
+      <w:r>
+        <w:rPr>
+          <w:noProof/>
+        </w:rPr>
+        <w:t>4</w:t>
+      </w:r>
+      <w:r>
+        <w:rPr>
+          <w:noProof/>
+        </w:rPr>
+        <w:fldChar w:fldCharType="end"/>
+      </w:r>
       <w:r>
         <w:t>.</w:t>
       </w:r>
-      <w:fldSimple w:instr=" SEQ Bảng \* ARABIC \s 1 ">
-        <w:r>
-          <w:rPr>
-            <w:noProof/>
-          </w:rPr>
-          <w:t>20</w:t>
-        </w:r>
-      </w:fldSimple>
+      <w:r>
+        <w:fldChar w:fldCharType="begin"/>
+      </w:r>
+      <w:r>
+        <w:instrText xml:space="preserve"> SEQ Bảng \* ARABIC \s 1 </w:instrText>
+      </w:r>
+      <w:r>
+        <w:fldChar w:fldCharType="separate"/>
+      </w:r>
+      <w:r>
+        <w:rPr>
+          <w:noProof/>
+        </w:rPr>
+        <w:t>20</w:t>
+      </w:r>
+      <w:r>
+        <w:rPr>
+          <w:noProof/>
+        </w:rPr>
+        <w:fldChar w:fldCharType="end"/>
+      </w:r>
       <w:r>
         <w:rPr>
           <w:lang w:val="en-US"/>
@@ -34387,25 +34669,51 @@
       <w:r>
         <w:t xml:space="preserve">Hình </w:t>
       </w:r>
-      <w:fldSimple w:instr=" STYLEREF 1 \s ">
-        <w:r>
-          <w:rPr>
-            <w:noProof/>
-          </w:rPr>
-          <w:t>4</w:t>
-        </w:r>
-      </w:fldSimple>
+      <w:r>
+        <w:fldChar w:fldCharType="begin"/>
+      </w:r>
+      <w:r>
+        <w:instrText xml:space="preserve"> STYLEREF 1 \s </w:instrText>
+      </w:r>
+      <w:r>
+        <w:fldChar w:fldCharType="separate"/>
+      </w:r>
+      <w:r>
+        <w:rPr>
+          <w:noProof/>
+        </w:rPr>
+        <w:t>4</w:t>
+      </w:r>
+      <w:r>
+        <w:rPr>
+          <w:noProof/>
+        </w:rPr>
+        <w:fldChar w:fldCharType="end"/>
+      </w:r>
       <w:r>
         <w:t>.</w:t>
       </w:r>
-      <w:fldSimple w:instr=" SEQ Hình \* ARABIC \s 1 ">
-        <w:r>
-          <w:rPr>
-            <w:noProof/>
-          </w:rPr>
-          <w:t>17</w:t>
-        </w:r>
-      </w:fldSimple>
+      <w:r>
+        <w:fldChar w:fldCharType="begin"/>
+      </w:r>
+      <w:r>
+        <w:instrText xml:space="preserve"> SEQ Hình \* ARABIC \s 1 </w:instrText>
+      </w:r>
+      <w:r>
+        <w:fldChar w:fldCharType="separate"/>
+      </w:r>
+      <w:r>
+        <w:rPr>
+          <w:noProof/>
+        </w:rPr>
+        <w:t>17</w:t>
+      </w:r>
+      <w:r>
+        <w:rPr>
+          <w:noProof/>
+        </w:rPr>
+        <w:fldChar w:fldCharType="end"/>
+      </w:r>
       <w:r>
         <w:rPr>
           <w:noProof/>
@@ -35063,25 +35371,51 @@
       <w:r>
         <w:t xml:space="preserve">Bảng </w:t>
       </w:r>
-      <w:fldSimple w:instr=" STYLEREF 1 \s ">
-        <w:r>
-          <w:rPr>
-            <w:noProof/>
-          </w:rPr>
-          <w:t>4</w:t>
-        </w:r>
-      </w:fldSimple>
+      <w:r>
+        <w:fldChar w:fldCharType="begin"/>
+      </w:r>
+      <w:r>
+        <w:instrText xml:space="preserve"> STYLEREF 1 \s </w:instrText>
+      </w:r>
+      <w:r>
+        <w:fldChar w:fldCharType="separate"/>
+      </w:r>
+      <w:r>
+        <w:rPr>
+          <w:noProof/>
+        </w:rPr>
+        <w:t>4</w:t>
+      </w:r>
+      <w:r>
+        <w:rPr>
+          <w:noProof/>
+        </w:rPr>
+        <w:fldChar w:fldCharType="end"/>
+      </w:r>
       <w:r>
         <w:t>.</w:t>
       </w:r>
-      <w:fldSimple w:instr=" SEQ Bảng \* ARABIC \s 1 ">
-        <w:r>
-          <w:rPr>
-            <w:noProof/>
-          </w:rPr>
-          <w:t>21</w:t>
-        </w:r>
-      </w:fldSimple>
+      <w:r>
+        <w:fldChar w:fldCharType="begin"/>
+      </w:r>
+      <w:r>
+        <w:instrText xml:space="preserve"> SEQ Bảng \* ARABIC \s 1 </w:instrText>
+      </w:r>
+      <w:r>
+        <w:fldChar w:fldCharType="separate"/>
+      </w:r>
+      <w:r>
+        <w:rPr>
+          <w:noProof/>
+        </w:rPr>
+        <w:t>21</w:t>
+      </w:r>
+      <w:r>
+        <w:rPr>
+          <w:noProof/>
+        </w:rPr>
+        <w:fldChar w:fldCharType="end"/>
+      </w:r>
       <w:r>
         <w:rPr>
           <w:lang w:val="en-US"/>
@@ -35111,7 +35445,7 @@
 </file>
 
 <file path=word/endnotes.xml><?xml version="1.0" encoding="utf-8"?>
-<w:endnotes xmlns:wpc="http://schemas.microsoft.com/office/word/2010/wordprocessingCanvas" xmlns:cx="http://schemas.microsoft.com/office/drawing/2014/chartex" xmlns:cx1="http://schemas.microsoft.com/office/drawing/2015/9/8/chartex" xmlns:cx2="http://schemas.microsoft.com/office/drawing/2015/10/21/chartex" xmlns:cx3="http://schemas.microsoft.com/office/drawing/2016/5/9/chartex" xmlns:cx4="http://schemas.microsoft.com/office/drawing/2016/5/10/chartex" xmlns:cx5="http://schemas.microsoft.com/office/drawing/2016/5/11/chartex" xmlns:cx6="http://schemas.microsoft.com/office/drawing/2016/5/12/chartex" xmlns:cx7="http://schemas.microsoft.com/office/drawing/2016/5/13/chartex" xmlns:cx8="http://schemas.microsoft.com/office/drawing/2016/5/14/chartex" xmlns:mc="http://schemas.openxmlformats.org/markup-compatibility/2006" xmlns:aink="http://schemas.microsoft.com/office/drawing/2016/ink" xmlns:am3d="http://schemas.microsoft.com/office/drawing/2017/model3d" xmlns:o="urn:schemas-microsoft-com:office:office" xmlns:r="http://schemas.openxmlformats.org/officeDocument/2006/relationships" xmlns:m="http://schemas.openxmlformats.org/officeDocument/2006/math" xmlns:v="urn:schemas-microsoft-com:vml" xmlns:wp14="http://schemas.microsoft.com/office/word/2010/wordprocessingDrawing" xmlns:wp="http://schemas.openxmlformats.org/drawingml/2006/wordprocessingDrawing" xmlns:w10="urn:schemas-microsoft-com:office:word" xmlns:w="http://schemas.openxmlformats.org/wordprocessingml/2006/main" xmlns:w14="http://schemas.microsoft.com/office/word/2010/wordml" xmlns:w15="http://schemas.microsoft.com/office/word/2012/wordml" xmlns:w16cex="http://schemas.microsoft.com/office/word/2018/wordml/cex" xmlns:w16cid="http://schemas.microsoft.com/office/word/2016/wordml/cid" xmlns:w16="http://schemas.microsoft.com/office/word/2018/wordml" xmlns:w16sdtdh="http://schemas.microsoft.com/office/word/2020/wordml/sdtdatahash" xmlns:w16se="http://schemas.microsoft.com/office/word/2015/wordml/symex" xmlns:wpg="http://schemas.microsoft.com/office/word/2010/wordprocessingGroup" xmlns:wpi="http://schemas.microsoft.com/office/word/2010/wordprocessingInk" xmlns:wne="http://schemas.microsoft.com/office/word/2006/wordml" xmlns:wps="http://schemas.microsoft.com/office/word/2010/wordprocessingShape" mc:Ignorable="w14 w15 w16se w16cid w16 w16cex w16sdtdh wp14">
+<w:endnotes xmlns:wpc="http://schemas.microsoft.com/office/word/2010/wordprocessingCanvas" xmlns:cx="http://schemas.microsoft.com/office/drawing/2014/chartex" xmlns:cx1="http://schemas.microsoft.com/office/drawing/2015/9/8/chartex" xmlns:cx2="http://schemas.microsoft.com/office/drawing/2015/10/21/chartex" xmlns:cx3="http://schemas.microsoft.com/office/drawing/2016/5/9/chartex" xmlns:cx4="http://schemas.microsoft.com/office/drawing/2016/5/10/chartex" xmlns:cx5="http://schemas.microsoft.com/office/drawing/2016/5/11/chartex" xmlns:cx6="http://schemas.microsoft.com/office/drawing/2016/5/12/chartex" xmlns:cx7="http://schemas.microsoft.com/office/drawing/2016/5/13/chartex" xmlns:cx8="http://schemas.microsoft.com/office/drawing/2016/5/14/chartex" xmlns:mc="http://schemas.openxmlformats.org/markup-compatibility/2006" xmlns:aink="http://schemas.microsoft.com/office/drawing/2016/ink" xmlns:am3d="http://schemas.microsoft.com/office/drawing/2017/model3d" xmlns:o="urn:schemas-microsoft-com:office:office" xmlns:oel="http://schemas.microsoft.com/office/2019/extlst" xmlns:r="http://schemas.openxmlformats.org/officeDocument/2006/relationships" xmlns:m="http://schemas.openxmlformats.org/officeDocument/2006/math" xmlns:v="urn:schemas-microsoft-com:vml" xmlns:wp14="http://schemas.microsoft.com/office/word/2010/wordprocessingDrawing" xmlns:wp="http://schemas.openxmlformats.org/drawingml/2006/wordprocessingDrawing" xmlns:w10="urn:schemas-microsoft-com:office:word" xmlns:w="http://schemas.openxmlformats.org/wordprocessingml/2006/main" xmlns:w14="http://schemas.microsoft.com/office/word/2010/wordml" xmlns:w15="http://schemas.microsoft.com/office/word/2012/wordml" xmlns:w16cex="http://schemas.microsoft.com/office/word/2018/wordml/cex" xmlns:w16cid="http://schemas.microsoft.com/office/word/2016/wordml/cid" xmlns:w16="http://schemas.microsoft.com/office/word/2018/wordml" xmlns:w16sdtdh="http://schemas.microsoft.com/office/word/2020/wordml/sdtdatahash" xmlns:w16se="http://schemas.microsoft.com/office/word/2015/wordml/symex" xmlns:wpg="http://schemas.microsoft.com/office/word/2010/wordprocessingGroup" xmlns:wpi="http://schemas.microsoft.com/office/word/2010/wordprocessingInk" xmlns:wne="http://schemas.microsoft.com/office/word/2006/wordml" xmlns:wps="http://schemas.microsoft.com/office/word/2010/wordprocessingShape" mc:Ignorable="w14 w15 w16se w16cid w16 w16cex w16sdtdh wp14">
   <w:endnote w:type="separator" w:id="-1">
     <w:p>
       <w:pPr>
@@ -35136,7 +35470,7 @@
 </file>
 
 <file path=word/footer1.xml><?xml version="1.0" encoding="utf-8"?>
-<w:ftr xmlns:wpc="http://schemas.microsoft.com/office/word/2010/wordprocessingCanvas" xmlns:cx="http://schemas.microsoft.com/office/drawing/2014/chartex" xmlns:cx1="http://schemas.microsoft.com/office/drawing/2015/9/8/chartex" xmlns:cx2="http://schemas.microsoft.com/office/drawing/2015/10/21/chartex" xmlns:cx3="http://schemas.microsoft.com/office/drawing/2016/5/9/chartex" xmlns:cx4="http://schemas.microsoft.com/office/drawing/2016/5/10/chartex" xmlns:cx5="http://schemas.microsoft.com/office/drawing/2016/5/11/chartex" xmlns:cx6="http://schemas.microsoft.com/office/drawing/2016/5/12/chartex" xmlns:cx7="http://schemas.microsoft.com/office/drawing/2016/5/13/chartex" xmlns:cx8="http://schemas.microsoft.com/office/drawing/2016/5/14/chartex" xmlns:mc="http://schemas.openxmlformats.org/markup-compatibility/2006" xmlns:aink="http://schemas.microsoft.com/office/drawing/2016/ink" xmlns:am3d="http://schemas.microsoft.com/office/drawing/2017/model3d" xmlns:o="urn:schemas-microsoft-com:office:office" xmlns:r="http://schemas.openxmlformats.org/officeDocument/2006/relationships" xmlns:m="http://schemas.openxmlformats.org/officeDocument/2006/math" xmlns:v="urn:schemas-microsoft-com:vml" xmlns:wp14="http://schemas.microsoft.com/office/word/2010/wordprocessingDrawing" xmlns:wp="http://schemas.openxmlformats.org/drawingml/2006/wordprocessingDrawing" xmlns:w10="urn:schemas-microsoft-com:office:word" xmlns:w="http://schemas.openxmlformats.org/wordprocessingml/2006/main" xmlns:w14="http://schemas.microsoft.com/office/word/2010/wordml" xmlns:w15="http://schemas.microsoft.com/office/word/2012/wordml" xmlns:w16cex="http://schemas.microsoft.com/office/word/2018/wordml/cex" xmlns:w16cid="http://schemas.microsoft.com/office/word/2016/wordml/cid" xmlns:w16="http://schemas.microsoft.com/office/word/2018/wordml" xmlns:w16sdtdh="http://schemas.microsoft.com/office/word/2020/wordml/sdtdatahash" xmlns:w16se="http://schemas.microsoft.com/office/word/2015/wordml/symex" xmlns:wpg="http://schemas.microsoft.com/office/word/2010/wordprocessingGroup" xmlns:wpi="http://schemas.microsoft.com/office/word/2010/wordprocessingInk" xmlns:wne="http://schemas.microsoft.com/office/word/2006/wordml" xmlns:wps="http://schemas.microsoft.com/office/word/2010/wordprocessingShape" mc:Ignorable="w14 w15 w16se w16cid w16 w16cex w16sdtdh wp14">
+<w:ftr xmlns:wpc="http://schemas.microsoft.com/office/word/2010/wordprocessingCanvas" xmlns:cx="http://schemas.microsoft.com/office/drawing/2014/chartex" xmlns:cx1="http://schemas.microsoft.com/office/drawing/2015/9/8/chartex" xmlns:cx2="http://schemas.microsoft.com/office/drawing/2015/10/21/chartex" xmlns:cx3="http://schemas.microsoft.com/office/drawing/2016/5/9/chartex" xmlns:cx4="http://schemas.microsoft.com/office/drawing/2016/5/10/chartex" xmlns:cx5="http://schemas.microsoft.com/office/drawing/2016/5/11/chartex" xmlns:cx6="http://schemas.microsoft.com/office/drawing/2016/5/12/chartex" xmlns:cx7="http://schemas.microsoft.com/office/drawing/2016/5/13/chartex" xmlns:cx8="http://schemas.microsoft.com/office/drawing/2016/5/14/chartex" xmlns:mc="http://schemas.openxmlformats.org/markup-compatibility/2006" xmlns:aink="http://schemas.microsoft.com/office/drawing/2016/ink" xmlns:am3d="http://schemas.microsoft.com/office/drawing/2017/model3d" xmlns:o="urn:schemas-microsoft-com:office:office" xmlns:oel="http://schemas.microsoft.com/office/2019/extlst" xmlns:r="http://schemas.openxmlformats.org/officeDocument/2006/relationships" xmlns:m="http://schemas.openxmlformats.org/officeDocument/2006/math" xmlns:v="urn:schemas-microsoft-com:vml" xmlns:wp14="http://schemas.microsoft.com/office/word/2010/wordprocessingDrawing" xmlns:wp="http://schemas.openxmlformats.org/drawingml/2006/wordprocessingDrawing" xmlns:w10="urn:schemas-microsoft-com:office:word" xmlns:w="http://schemas.openxmlformats.org/wordprocessingml/2006/main" xmlns:w14="http://schemas.microsoft.com/office/word/2010/wordml" xmlns:w15="http://schemas.microsoft.com/office/word/2012/wordml" xmlns:w16cex="http://schemas.microsoft.com/office/word/2018/wordml/cex" xmlns:w16cid="http://schemas.microsoft.com/office/word/2016/wordml/cid" xmlns:w16="http://schemas.microsoft.com/office/word/2018/wordml" xmlns:w16sdtdh="http://schemas.microsoft.com/office/word/2020/wordml/sdtdatahash" xmlns:w16se="http://schemas.microsoft.com/office/word/2015/wordml/symex" xmlns:wpg="http://schemas.microsoft.com/office/word/2010/wordprocessingGroup" xmlns:wpi="http://schemas.microsoft.com/office/word/2010/wordprocessingInk" xmlns:wne="http://schemas.microsoft.com/office/word/2006/wordml" xmlns:wps="http://schemas.microsoft.com/office/word/2010/wordprocessingShape" mc:Ignorable="w14 w15 w16se w16cid w16 w16cex w16sdtdh wp14">
   <w:sdt>
     <w:sdtPr>
       <w:id w:val="-307324234"/>
@@ -35189,7 +35523,7 @@
 </file>
 
 <file path=word/footer2.xml><?xml version="1.0" encoding="utf-8"?>
-<w:ftr xmlns:wpc="http://schemas.microsoft.com/office/word/2010/wordprocessingCanvas" xmlns:cx="http://schemas.microsoft.com/office/drawing/2014/chartex" xmlns:cx1="http://schemas.microsoft.com/office/drawing/2015/9/8/chartex" xmlns:cx2="http://schemas.microsoft.com/office/drawing/2015/10/21/chartex" xmlns:cx3="http://schemas.microsoft.com/office/drawing/2016/5/9/chartex" xmlns:cx4="http://schemas.microsoft.com/office/drawing/2016/5/10/chartex" xmlns:cx5="http://schemas.microsoft.com/office/drawing/2016/5/11/chartex" xmlns:cx6="http://schemas.microsoft.com/office/drawing/2016/5/12/chartex" xmlns:cx7="http://schemas.microsoft.com/office/drawing/2016/5/13/chartex" xmlns:cx8="http://schemas.microsoft.com/office/drawing/2016/5/14/chartex" xmlns:mc="http://schemas.openxmlformats.org/markup-compatibility/2006" xmlns:aink="http://schemas.microsoft.com/office/drawing/2016/ink" xmlns:am3d="http://schemas.microsoft.com/office/drawing/2017/model3d" xmlns:o="urn:schemas-microsoft-com:office:office" xmlns:r="http://schemas.openxmlformats.org/officeDocument/2006/relationships" xmlns:m="http://schemas.openxmlformats.org/officeDocument/2006/math" xmlns:v="urn:schemas-microsoft-com:vml" xmlns:wp14="http://schemas.microsoft.com/office/word/2010/wordprocessingDrawing" xmlns:wp="http://schemas.openxmlformats.org/drawingml/2006/wordprocessingDrawing" xmlns:w10="urn:schemas-microsoft-com:office:word" xmlns:w="http://schemas.openxmlformats.org/wordprocessingml/2006/main" xmlns:w14="http://schemas.microsoft.com/office/word/2010/wordml" xmlns:w15="http://schemas.microsoft.com/office/word/2012/wordml" xmlns:w16cex="http://schemas.microsoft.com/office/word/2018/wordml/cex" xmlns:w16cid="http://schemas.microsoft.com/office/word/2016/wordml/cid" xmlns:w16="http://schemas.microsoft.com/office/word/2018/wordml" xmlns:w16sdtdh="http://schemas.microsoft.com/office/word/2020/wordml/sdtdatahash" xmlns:w16se="http://schemas.microsoft.com/office/word/2015/wordml/symex" xmlns:wpg="http://schemas.microsoft.com/office/word/2010/wordprocessingGroup" xmlns:wpi="http://schemas.microsoft.com/office/word/2010/wordprocessingInk" xmlns:wne="http://schemas.microsoft.com/office/word/2006/wordml" xmlns:wps="http://schemas.microsoft.com/office/word/2010/wordprocessingShape" mc:Ignorable="w14 w15 w16se w16cid w16 w16cex w16sdtdh wp14">
+<w:ftr xmlns:wpc="http://schemas.microsoft.com/office/word/2010/wordprocessingCanvas" xmlns:cx="http://schemas.microsoft.com/office/drawing/2014/chartex" xmlns:cx1="http://schemas.microsoft.com/office/drawing/2015/9/8/chartex" xmlns:cx2="http://schemas.microsoft.com/office/drawing/2015/10/21/chartex" xmlns:cx3="http://schemas.microsoft.com/office/drawing/2016/5/9/chartex" xmlns:cx4="http://schemas.microsoft.com/office/drawing/2016/5/10/chartex" xmlns:cx5="http://schemas.microsoft.com/office/drawing/2016/5/11/chartex" xmlns:cx6="http://schemas.microsoft.com/office/drawing/2016/5/12/chartex" xmlns:cx7="http://schemas.microsoft.com/office/drawing/2016/5/13/chartex" xmlns:cx8="http://schemas.microsoft.com/office/drawing/2016/5/14/chartex" xmlns:mc="http://schemas.openxmlformats.org/markup-compatibility/2006" xmlns:aink="http://schemas.microsoft.com/office/drawing/2016/ink" xmlns:am3d="http://schemas.microsoft.com/office/drawing/2017/model3d" xmlns:o="urn:schemas-microsoft-com:office:office" xmlns:oel="http://schemas.microsoft.com/office/2019/extlst" xmlns:r="http://schemas.openxmlformats.org/officeDocument/2006/relationships" xmlns:m="http://schemas.openxmlformats.org/officeDocument/2006/math" xmlns:v="urn:schemas-microsoft-com:vml" xmlns:wp14="http://schemas.microsoft.com/office/word/2010/wordprocessingDrawing" xmlns:wp="http://schemas.openxmlformats.org/drawingml/2006/wordprocessingDrawing" xmlns:w10="urn:schemas-microsoft-com:office:word" xmlns:w="http://schemas.openxmlformats.org/wordprocessingml/2006/main" xmlns:w14="http://schemas.microsoft.com/office/word/2010/wordml" xmlns:w15="http://schemas.microsoft.com/office/word/2012/wordml" xmlns:w16cex="http://schemas.microsoft.com/office/word/2018/wordml/cex" xmlns:w16cid="http://schemas.microsoft.com/office/word/2016/wordml/cid" xmlns:w16="http://schemas.microsoft.com/office/word/2018/wordml" xmlns:w16sdtdh="http://schemas.microsoft.com/office/word/2020/wordml/sdtdatahash" xmlns:w16se="http://schemas.microsoft.com/office/word/2015/wordml/symex" xmlns:wpg="http://schemas.microsoft.com/office/word/2010/wordprocessingGroup" xmlns:wpi="http://schemas.microsoft.com/office/word/2010/wordprocessingInk" xmlns:wne="http://schemas.microsoft.com/office/word/2006/wordml" xmlns:wps="http://schemas.microsoft.com/office/word/2010/wordprocessingShape" mc:Ignorable="w14 w15 w16se w16cid w16 w16cex w16sdtdh wp14">
   <w:sdt>
     <w:sdtPr>
       <w:id w:val="-1586215214"/>
@@ -35245,7 +35579,7 @@
 </file>
 
 <file path=word/footnotes.xml><?xml version="1.0" encoding="utf-8"?>
-<w:footnotes xmlns:wpc="http://schemas.microsoft.com/office/word/2010/wordprocessingCanvas" xmlns:cx="http://schemas.microsoft.com/office/drawing/2014/chartex" xmlns:cx1="http://schemas.microsoft.com/office/drawing/2015/9/8/chartex" xmlns:cx2="http://schemas.microsoft.com/office/drawing/2015/10/21/chartex" xmlns:cx3="http://schemas.microsoft.com/office/drawing/2016/5/9/chartex" xmlns:cx4="http://schemas.microsoft.com/office/drawing/2016/5/10/chartex" xmlns:cx5="http://schemas.microsoft.com/office/drawing/2016/5/11/chartex" xmlns:cx6="http://schemas.microsoft.com/office/drawing/2016/5/12/chartex" xmlns:cx7="http://schemas.microsoft.com/office/drawing/2016/5/13/chartex" xmlns:cx8="http://schemas.microsoft.com/office/drawing/2016/5/14/chartex" xmlns:mc="http://schemas.openxmlformats.org/markup-compatibility/2006" xmlns:aink="http://schemas.microsoft.com/office/drawing/2016/ink" xmlns:am3d="http://schemas.microsoft.com/office/drawing/2017/model3d" xmlns:o="urn:schemas-microsoft-com:office:office" xmlns:r="http://schemas.openxmlformats.org/officeDocument/2006/relationships" xmlns:m="http://schemas.openxmlformats.org/officeDocument/2006/math" xmlns:v="urn:schemas-microsoft-com:vml" xmlns:wp14="http://schemas.microsoft.com/office/word/2010/wordprocessingDrawing" xmlns:wp="http://schemas.openxmlformats.org/drawingml/2006/wordprocessingDrawing" xmlns:w10="urn:schemas-microsoft-com:office:word" xmlns:w="http://schemas.openxmlformats.org/wordprocessingml/2006/main" xmlns:w14="http://schemas.microsoft.com/office/word/2010/wordml" xmlns:w15="http://schemas.microsoft.com/office/word/2012/wordml" xmlns:w16cex="http://schemas.microsoft.com/office/word/2018/wordml/cex" xmlns:w16cid="http://schemas.microsoft.com/office/word/2016/wordml/cid" xmlns:w16="http://schemas.microsoft.com/office/word/2018/wordml" xmlns:w16sdtdh="http://schemas.microsoft.com/office/word/2020/wordml/sdtdatahash" xmlns:w16se="http://schemas.microsoft.com/office/word/2015/wordml/symex" xmlns:wpg="http://schemas.microsoft.com/office/word/2010/wordprocessingGroup" xmlns:wpi="http://schemas.microsoft.com/office/word/2010/wordprocessingInk" xmlns:wne="http://schemas.microsoft.com/office/word/2006/wordml" xmlns:wps="http://schemas.microsoft.com/office/word/2010/wordprocessingShape" mc:Ignorable="w14 w15 w16se w16cid w16 w16cex w16sdtdh wp14">
+<w:footnotes xmlns:wpc="http://schemas.microsoft.com/office/word/2010/wordprocessingCanvas" xmlns:cx="http://schemas.microsoft.com/office/drawing/2014/chartex" xmlns:cx1="http://schemas.microsoft.com/office/drawing/2015/9/8/chartex" xmlns:cx2="http://schemas.microsoft.com/office/drawing/2015/10/21/chartex" xmlns:cx3="http://schemas.microsoft.com/office/drawing/2016/5/9/chartex" xmlns:cx4="http://schemas.microsoft.com/office/drawing/2016/5/10/chartex" xmlns:cx5="http://schemas.microsoft.com/office/drawing/2016/5/11/chartex" xmlns:cx6="http://schemas.microsoft.com/office/drawing/2016/5/12/chartex" xmlns:cx7="http://schemas.microsoft.com/office/drawing/2016/5/13/chartex" xmlns:cx8="http://schemas.microsoft.com/office/drawing/2016/5/14/chartex" xmlns:mc="http://schemas.openxmlformats.org/markup-compatibility/2006" xmlns:aink="http://schemas.microsoft.com/office/drawing/2016/ink" xmlns:am3d="http://schemas.microsoft.com/office/drawing/2017/model3d" xmlns:o="urn:schemas-microsoft-com:office:office" xmlns:oel="http://schemas.microsoft.com/office/2019/extlst" xmlns:r="http://schemas.openxmlformats.org/officeDocument/2006/relationships" xmlns:m="http://schemas.openxmlformats.org/officeDocument/2006/math" xmlns:v="urn:schemas-microsoft-com:vml" xmlns:wp14="http://schemas.microsoft.com/office/word/2010/wordprocessingDrawing" xmlns:wp="http://schemas.openxmlformats.org/drawingml/2006/wordprocessingDrawing" xmlns:w10="urn:schemas-microsoft-com:office:word" xmlns:w="http://schemas.openxmlformats.org/wordprocessingml/2006/main" xmlns:w14="http://schemas.microsoft.com/office/word/2010/wordml" xmlns:w15="http://schemas.microsoft.com/office/word/2012/wordml" xmlns:w16cex="http://schemas.microsoft.com/office/word/2018/wordml/cex" xmlns:w16cid="http://schemas.microsoft.com/office/word/2016/wordml/cid" xmlns:w16="http://schemas.microsoft.com/office/word/2018/wordml" xmlns:w16sdtdh="http://schemas.microsoft.com/office/word/2020/wordml/sdtdatahash" xmlns:w16se="http://schemas.microsoft.com/office/word/2015/wordml/symex" xmlns:wpg="http://schemas.microsoft.com/office/word/2010/wordprocessingGroup" xmlns:wpi="http://schemas.microsoft.com/office/word/2010/wordprocessingInk" xmlns:wne="http://schemas.microsoft.com/office/word/2006/wordml" xmlns:wps="http://schemas.microsoft.com/office/word/2010/wordprocessingShape" mc:Ignorable="w14 w15 w16se w16cid w16 w16cex w16sdtdh wp14">
   <w:footnote w:type="separator" w:id="-1">
     <w:p>
       <w:pPr>
@@ -35270,7 +35604,7 @@
 </file>
 
 <file path=word/numbering.xml><?xml version="1.0" encoding="utf-8"?>
-<w:numbering xmlns:wpc="http://schemas.microsoft.com/office/word/2010/wordprocessingCanvas" xmlns:cx="http://schemas.microsoft.com/office/drawing/2014/chartex" xmlns:cx1="http://schemas.microsoft.com/office/drawing/2015/9/8/chartex" xmlns:cx2="http://schemas.microsoft.com/office/drawing/2015/10/21/chartex" xmlns:cx3="http://schemas.microsoft.com/office/drawing/2016/5/9/chartex" xmlns:cx4="http://schemas.microsoft.com/office/drawing/2016/5/10/chartex" xmlns:cx5="http://schemas.microsoft.com/office/drawing/2016/5/11/chartex" xmlns:cx6="http://schemas.microsoft.com/office/drawing/2016/5/12/chartex" xmlns:cx7="http://schemas.microsoft.com/office/drawing/2016/5/13/chartex" xmlns:cx8="http://schemas.microsoft.com/office/drawing/2016/5/14/chartex" xmlns:mc="http://schemas.openxmlformats.org/markup-compatibility/2006" xmlns:aink="http://schemas.microsoft.com/office/drawing/2016/ink" xmlns:am3d="http://schemas.microsoft.com/office/drawing/2017/model3d" xmlns:o="urn:schemas-microsoft-com:office:office" xmlns:r="http://schemas.openxmlformats.org/officeDocument/2006/relationships" xmlns:m="http://schemas.openxmlformats.org/officeDocument/2006/math" xmlns:v="urn:schemas-microsoft-com:vml" xmlns:wp14="http://schemas.microsoft.com/office/word/2010/wordprocessingDrawing" xmlns:wp="http://schemas.openxmlformats.org/drawingml/2006/wordprocessingDrawing" xmlns:w10="urn:schemas-microsoft-com:office:word" xmlns:w="http://schemas.openxmlformats.org/wordprocessingml/2006/main" xmlns:w14="http://schemas.microsoft.com/office/word/2010/wordml" xmlns:w15="http://schemas.microsoft.com/office/word/2012/wordml" xmlns:w16cex="http://schemas.microsoft.com/office/word/2018/wordml/cex" xmlns:w16cid="http://schemas.microsoft.com/office/word/2016/wordml/cid" xmlns:w16="http://schemas.microsoft.com/office/word/2018/wordml" xmlns:w16sdtdh="http://schemas.microsoft.com/office/word/2020/wordml/sdtdatahash" xmlns:w16se="http://schemas.microsoft.com/office/word/2015/wordml/symex" xmlns:wpg="http://schemas.microsoft.com/office/word/2010/wordprocessingGroup" xmlns:wpi="http://schemas.microsoft.com/office/word/2010/wordprocessingInk" xmlns:wne="http://schemas.microsoft.com/office/word/2006/wordml" xmlns:wps="http://schemas.microsoft.com/office/word/2010/wordprocessingShape" mc:Ignorable="w14 w15 w16se w16cid w16 w16cex w16sdtdh wp14">
+<w:numbering xmlns:wpc="http://schemas.microsoft.com/office/word/2010/wordprocessingCanvas" xmlns:cx="http://schemas.microsoft.com/office/drawing/2014/chartex" xmlns:cx1="http://schemas.microsoft.com/office/drawing/2015/9/8/chartex" xmlns:cx2="http://schemas.microsoft.com/office/drawing/2015/10/21/chartex" xmlns:cx3="http://schemas.microsoft.com/office/drawing/2016/5/9/chartex" xmlns:cx4="http://schemas.microsoft.com/office/drawing/2016/5/10/chartex" xmlns:cx5="http://schemas.microsoft.com/office/drawing/2016/5/11/chartex" xmlns:cx6="http://schemas.microsoft.com/office/drawing/2016/5/12/chartex" xmlns:cx7="http://schemas.microsoft.com/office/drawing/2016/5/13/chartex" xmlns:cx8="http://schemas.microsoft.com/office/drawing/2016/5/14/chartex" xmlns:mc="http://schemas.openxmlformats.org/markup-compatibility/2006" xmlns:aink="http://schemas.microsoft.com/office/drawing/2016/ink" xmlns:am3d="http://schemas.microsoft.com/office/drawing/2017/model3d" xmlns:o="urn:schemas-microsoft-com:office:office" xmlns:oel="http://schemas.microsoft.com/office/2019/extlst" xmlns:r="http://schemas.openxmlformats.org/officeDocument/2006/relationships" xmlns:m="http://schemas.openxmlformats.org/officeDocument/2006/math" xmlns:v="urn:schemas-microsoft-com:vml" xmlns:wp14="http://schemas.microsoft.com/office/word/2010/wordprocessingDrawing" xmlns:wp="http://schemas.openxmlformats.org/drawingml/2006/wordprocessingDrawing" xmlns:w10="urn:schemas-microsoft-com:office:word" xmlns:w="http://schemas.openxmlformats.org/wordprocessingml/2006/main" xmlns:w14="http://schemas.microsoft.com/office/word/2010/wordml" xmlns:w15="http://schemas.microsoft.com/office/word/2012/wordml" xmlns:w16cex="http://schemas.microsoft.com/office/word/2018/wordml/cex" xmlns:w16cid="http://schemas.microsoft.com/office/word/2016/wordml/cid" xmlns:w16="http://schemas.microsoft.com/office/word/2018/wordml" xmlns:w16sdtdh="http://schemas.microsoft.com/office/word/2020/wordml/sdtdatahash" xmlns:w16se="http://schemas.microsoft.com/office/word/2015/wordml/symex" xmlns:wpg="http://schemas.microsoft.com/office/word/2010/wordprocessingGroup" xmlns:wpi="http://schemas.microsoft.com/office/word/2010/wordprocessingInk" xmlns:wne="http://schemas.microsoft.com/office/word/2006/wordml" xmlns:wps="http://schemas.microsoft.com/office/word/2010/wordprocessingShape" mc:Ignorable="w14 w15 w16se w16cid w16 w16cex w16sdtdh wp14">
   <w:abstractNum w:abstractNumId="0" w15:restartNumberingAfterBreak="0">
     <w:nsid w:val="00B31026"/>
     <w:multiLevelType w:val="hybridMultilevel"/>
@@ -38473,10 +38807,10 @@
       </w:rPr>
     </w:lvl>
   </w:abstractNum>
-  <w:num w:numId="1">
+  <w:num w:numId="1" w16cid:durableId="536625521">
     <w:abstractNumId w:val="24"/>
   </w:num>
-  <w:num w:numId="2">
+  <w:num w:numId="2" w16cid:durableId="1916815381">
     <w:abstractNumId w:val="24"/>
     <w:lvlOverride w:ilvl="0">
       <w:startOverride w:val="2"/>
@@ -38488,40 +38822,40 @@
       <w:startOverride w:val="1"/>
     </w:lvlOverride>
   </w:num>
-  <w:num w:numId="3">
+  <w:num w:numId="3" w16cid:durableId="365330035">
     <w:abstractNumId w:val="10"/>
   </w:num>
-  <w:num w:numId="4">
+  <w:num w:numId="4" w16cid:durableId="70002812">
     <w:abstractNumId w:val="24"/>
   </w:num>
-  <w:num w:numId="5">
+  <w:num w:numId="5" w16cid:durableId="1764691557">
     <w:abstractNumId w:val="5"/>
   </w:num>
-  <w:num w:numId="6">
+  <w:num w:numId="6" w16cid:durableId="737752320">
     <w:abstractNumId w:val="8"/>
   </w:num>
-  <w:num w:numId="7">
+  <w:num w:numId="7" w16cid:durableId="1212810550">
     <w:abstractNumId w:val="26"/>
   </w:num>
-  <w:num w:numId="8">
+  <w:num w:numId="8" w16cid:durableId="1444378876">
     <w:abstractNumId w:val="4"/>
   </w:num>
-  <w:num w:numId="9">
+  <w:num w:numId="9" w16cid:durableId="838036978">
     <w:abstractNumId w:val="28"/>
   </w:num>
-  <w:num w:numId="10">
+  <w:num w:numId="10" w16cid:durableId="640116214">
     <w:abstractNumId w:val="6"/>
   </w:num>
-  <w:num w:numId="11">
+  <w:num w:numId="11" w16cid:durableId="2132698469">
     <w:abstractNumId w:val="3"/>
   </w:num>
-  <w:num w:numId="12">
+  <w:num w:numId="12" w16cid:durableId="1535577320">
     <w:abstractNumId w:val="13"/>
   </w:num>
-  <w:num w:numId="13">
+  <w:num w:numId="13" w16cid:durableId="1610429074">
     <w:abstractNumId w:val="0"/>
   </w:num>
-  <w:num w:numId="14">
+  <w:num w:numId="14" w16cid:durableId="2018266518">
     <w:abstractNumId w:val="24"/>
     <w:lvlOverride w:ilvl="0">
       <w:startOverride w:val="1"/>
@@ -38551,31 +38885,31 @@
       <w:startOverride w:val="1"/>
     </w:lvlOverride>
   </w:num>
-  <w:num w:numId="15">
+  <w:num w:numId="15" w16cid:durableId="904804504">
     <w:abstractNumId w:val="12"/>
   </w:num>
-  <w:num w:numId="16">
+  <w:num w:numId="16" w16cid:durableId="915895572">
     <w:abstractNumId w:val="25"/>
   </w:num>
-  <w:num w:numId="17">
+  <w:num w:numId="17" w16cid:durableId="727652286">
     <w:abstractNumId w:val="22"/>
   </w:num>
-  <w:num w:numId="18">
+  <w:num w:numId="18" w16cid:durableId="1669215195">
     <w:abstractNumId w:val="11"/>
   </w:num>
-  <w:num w:numId="19">
+  <w:num w:numId="19" w16cid:durableId="640767781">
     <w:abstractNumId w:val="29"/>
   </w:num>
-  <w:num w:numId="20">
+  <w:num w:numId="20" w16cid:durableId="172651525">
     <w:abstractNumId w:val="1"/>
   </w:num>
-  <w:num w:numId="21">
+  <w:num w:numId="21" w16cid:durableId="1425807545">
     <w:abstractNumId w:val="20"/>
   </w:num>
-  <w:num w:numId="22">
+  <w:num w:numId="22" w16cid:durableId="469789942">
     <w:abstractNumId w:val="10"/>
   </w:num>
-  <w:num w:numId="23">
+  <w:num w:numId="23" w16cid:durableId="538510918">
     <w:abstractNumId w:val="5"/>
     <w:lvlOverride w:ilvl="0">
       <w:startOverride w:val="1"/>
@@ -38605,46 +38939,46 @@
       <w:startOverride w:val="1"/>
     </w:lvlOverride>
   </w:num>
-  <w:num w:numId="24">
+  <w:num w:numId="24" w16cid:durableId="851991568">
     <w:abstractNumId w:val="2"/>
   </w:num>
-  <w:num w:numId="25">
+  <w:num w:numId="25" w16cid:durableId="14236177">
     <w:abstractNumId w:val="9"/>
   </w:num>
-  <w:num w:numId="26">
+  <w:num w:numId="26" w16cid:durableId="336730545">
     <w:abstractNumId w:val="27"/>
   </w:num>
-  <w:num w:numId="27">
+  <w:num w:numId="27" w16cid:durableId="1782066076">
     <w:abstractNumId w:val="17"/>
   </w:num>
-  <w:num w:numId="28">
+  <w:num w:numId="28" w16cid:durableId="405498335">
     <w:abstractNumId w:val="23"/>
   </w:num>
-  <w:num w:numId="29">
+  <w:num w:numId="29" w16cid:durableId="38672338">
     <w:abstractNumId w:val="15"/>
   </w:num>
-  <w:num w:numId="30">
+  <w:num w:numId="30" w16cid:durableId="2081977701">
     <w:abstractNumId w:val="18"/>
   </w:num>
-  <w:num w:numId="31">
+  <w:num w:numId="31" w16cid:durableId="181749432">
     <w:abstractNumId w:val="21"/>
   </w:num>
-  <w:num w:numId="32">
+  <w:num w:numId="32" w16cid:durableId="1920598092">
     <w:abstractNumId w:val="7"/>
   </w:num>
-  <w:num w:numId="33">
+  <w:num w:numId="33" w16cid:durableId="1196238866">
     <w:abstractNumId w:val="19"/>
   </w:num>
-  <w:num w:numId="34">
+  <w:num w:numId="34" w16cid:durableId="1976639300">
     <w:abstractNumId w:val="14"/>
   </w:num>
-  <w:num w:numId="35">
+  <w:num w:numId="35" w16cid:durableId="1479765834">
     <w:abstractNumId w:val="16"/>
   </w:num>
-  <w:num w:numId="36">
+  <w:num w:numId="36" w16cid:durableId="330646840">
     <w:abstractNumId w:val="30"/>
   </w:num>
-  <w:num w:numId="37">
+  <w:num w:numId="37" w16cid:durableId="1247572503">
     <w:abstractNumId w:val="24"/>
     <w:lvlOverride w:ilvl="0">
       <w:startOverride w:val="1"/>
@@ -38674,7 +39008,7 @@
       <w:startOverride w:val="1"/>
     </w:lvlOverride>
   </w:num>
-  <w:num w:numId="38">
+  <w:num w:numId="38" w16cid:durableId="1919174225">
     <w:abstractNumId w:val="24"/>
     <w:lvlOverride w:ilvl="0">
       <w:startOverride w:val="1"/>
@@ -38704,7 +39038,7 @@
       <w:startOverride w:val="1"/>
     </w:lvlOverride>
   </w:num>
-  <w:num w:numId="39">
+  <w:num w:numId="39" w16cid:durableId="1763062747">
     <w:abstractNumId w:val="24"/>
     <w:lvlOverride w:ilvl="0">
       <w:startOverride w:val="1"/>
@@ -38734,7 +39068,7 @@
       <w:startOverride w:val="1"/>
     </w:lvlOverride>
   </w:num>
-  <w:num w:numId="40">
+  <w:num w:numId="40" w16cid:durableId="1574004542">
     <w:abstractNumId w:val="24"/>
     <w:lvlOverride w:ilvl="0">
       <w:startOverride w:val="1"/>
@@ -38764,7 +39098,7 @@
       <w:startOverride w:val="1"/>
     </w:lvlOverride>
   </w:num>
-  <w:num w:numId="41">
+  <w:num w:numId="41" w16cid:durableId="183370111">
     <w:abstractNumId w:val="24"/>
     <w:lvlOverride w:ilvl="0">
       <w:startOverride w:val="1"/>
@@ -38794,7 +39128,7 @@
       <w:startOverride w:val="1"/>
     </w:lvlOverride>
   </w:num>
-  <w:num w:numId="42">
+  <w:num w:numId="42" w16cid:durableId="1789660719">
     <w:abstractNumId w:val="24"/>
     <w:lvlOverride w:ilvl="0">
       <w:startOverride w:val="1"/>
@@ -38824,7 +39158,7 @@
       <w:startOverride w:val="1"/>
     </w:lvlOverride>
   </w:num>
-  <w:num w:numId="43">
+  <w:num w:numId="43" w16cid:durableId="1900634276">
     <w:abstractNumId w:val="24"/>
     <w:lvlOverride w:ilvl="0">
       <w:startOverride w:val="1"/>

</xml_diff>